<commit_message>
Update models to 21.87% val and 23.29% test accuracy with 256 units and min_freq=2
</commit_message>
<xml_diff>
--- a/SakshamGupta_230911186_FGAI_Assignment2.docx
+++ b/SakshamGupta_230911186_FGAI_Assignment2.docx
@@ -257,7 +257,7 @@
         <w:t>• GRU (Gated Recurrent Unit with reset and update gates)</w:t>
         <w:br/>
         <w:br/>
-        <w:t>To eliminate data leakage, the corpus is split chronologically into 80% Train, 10% Validation, and 10% Test blocks, and the vocabulary is fitted solely on the training tokens. Input sequences of length 8 predict the 9th token.</w:t>
+        <w:t>To eliminate data leakage, the corpus is split chronologically into 80% Train, 10% Validation, and 10% Test blocks, and the vocabulary is fitted solely on the training tokens (min_freq=2). Input sequences of length 6 predict the 7th token.</w:t>
       </w:r>
     </w:p>
     <w:p>
@@ -443,7 +443,7 @@
               <w:rPr>
                 <w:sz w:val="17"/>
               </w:rPr>
-              <w:t>985,022</w:t>
+              <w:t>798,484</w:t>
             </w:r>
           </w:p>
         </w:tc>
@@ -456,7 +456,7 @@
               <w:rPr>
                 <w:sz w:val="17"/>
               </w:rPr>
-              <w:t>3</w:t>
+              <w:t>4</w:t>
             </w:r>
           </w:p>
         </w:tc>
@@ -469,7 +469,7 @@
               <w:rPr>
                 <w:sz w:val="17"/>
               </w:rPr>
-              <w:t>5.0287</w:t>
+              <w:t>4.0741</w:t>
             </w:r>
           </w:p>
         </w:tc>
@@ -482,7 +482,7 @@
               <w:rPr>
                 <w:sz w:val="17"/>
               </w:rPr>
-              <w:t>152.73</w:t>
+              <w:t>58.80</w:t>
             </w:r>
           </w:p>
         </w:tc>
@@ -495,7 +495,7 @@
               <w:rPr>
                 <w:sz w:val="17"/>
               </w:rPr>
-              <w:t>18.10%</w:t>
+              <w:t>19.73%</w:t>
             </w:r>
           </w:p>
         </w:tc>
@@ -508,7 +508,7 @@
               <w:rPr>
                 <w:sz w:val="17"/>
               </w:rPr>
-              <w:t>5.1567</w:t>
+              <w:t>4.1584</w:t>
             </w:r>
           </w:p>
         </w:tc>
@@ -521,7 +521,7 @@
               <w:rPr>
                 <w:sz w:val="17"/>
               </w:rPr>
-              <w:t>17.60%</w:t>
+              <w:t>20.80%</w:t>
             </w:r>
           </w:p>
         </w:tc>
@@ -534,7 +534,7 @@
               <w:rPr>
                 <w:sz w:val="17"/>
               </w:rPr>
-              <w:t>38.41%</w:t>
+              <w:t>45.28%</w:t>
             </w:r>
           </w:p>
         </w:tc>
@@ -563,7 +563,7 @@
               <w:rPr>
                 <w:sz w:val="17"/>
               </w:rPr>
-              <w:t>1,513,406</w:t>
+              <w:t>1,262,868</w:t>
             </w:r>
           </w:p>
         </w:tc>
@@ -589,7 +589,7 @@
               <w:rPr>
                 <w:sz w:val="17"/>
               </w:rPr>
-              <w:t>5.1401</w:t>
+              <w:t>4.2804</w:t>
             </w:r>
           </w:p>
         </w:tc>
@@ -602,7 +602,7 @@
               <w:rPr>
                 <w:sz w:val="17"/>
               </w:rPr>
-              <w:t>170.74</w:t>
+              <w:t>72.27</w:t>
             </w:r>
           </w:p>
         </w:tc>
@@ -615,7 +615,7 @@
               <w:rPr>
                 <w:sz w:val="17"/>
               </w:rPr>
-              <w:t>16.88%</w:t>
+              <w:t>18.66%</w:t>
             </w:r>
           </w:p>
         </w:tc>
@@ -628,7 +628,7 @@
               <w:rPr>
                 <w:sz w:val="17"/>
               </w:rPr>
-              <w:t>5.2474</w:t>
+              <w:t>4.3192</w:t>
             </w:r>
           </w:p>
         </w:tc>
@@ -641,7 +641,7 @@
               <w:rPr>
                 <w:sz w:val="17"/>
               </w:rPr>
-              <w:t>16.94%</w:t>
+              <w:t>18.47%</w:t>
             </w:r>
           </w:p>
         </w:tc>
@@ -654,7 +654,7 @@
               <w:rPr>
                 <w:sz w:val="17"/>
               </w:rPr>
-              <w:t>35.96%</w:t>
+              <w:t>42.26%</w:t>
             </w:r>
           </w:p>
         </w:tc>
@@ -683,7 +683,7 @@
               <w:rPr>
                 <w:sz w:val="17"/>
               </w:rPr>
-              <w:t>1,207,358</w:t>
+              <w:t>1,193,236</w:t>
             </w:r>
           </w:p>
         </w:tc>
@@ -696,7 +696,7 @@
               <w:rPr>
                 <w:sz w:val="17"/>
               </w:rPr>
-              <w:t>4</w:t>
+              <w:t>5</w:t>
             </w:r>
           </w:p>
         </w:tc>
@@ -709,7 +709,7 @@
               <w:rPr>
                 <w:sz w:val="17"/>
               </w:rPr>
-              <w:t>4.9778</w:t>
+              <w:t>3.9903</w:t>
             </w:r>
           </w:p>
         </w:tc>
@@ -722,7 +722,7 @@
               <w:rPr>
                 <w:sz w:val="17"/>
               </w:rPr>
-              <w:t>145.16</w:t>
+              <w:t>54.07</w:t>
             </w:r>
           </w:p>
         </w:tc>
@@ -735,7 +735,7 @@
               <w:rPr>
                 <w:sz w:val="17"/>
               </w:rPr>
-              <w:t>18.70%</w:t>
+              <w:t>21.87%</w:t>
             </w:r>
           </w:p>
         </w:tc>
@@ -748,7 +748,7 @@
               <w:rPr>
                 <w:sz w:val="17"/>
               </w:rPr>
-              <w:t>5.1261</w:t>
+              <w:t>4.0576</w:t>
             </w:r>
           </w:p>
         </w:tc>
@@ -761,7 +761,7 @@
               <w:rPr>
                 <w:sz w:val="17"/>
               </w:rPr>
-              <w:t>19.68%</w:t>
+              <w:t>23.29%</w:t>
             </w:r>
           </w:p>
         </w:tc>
@@ -774,7 +774,7 @@
               <w:rPr>
                 <w:sz w:val="17"/>
               </w:rPr>
-              <w:t>39.17%</w:t>
+              <w:t>47.23%</w:t>
             </w:r>
           </w:p>
         </w:tc>
@@ -803,7 +803,7 @@
               <w:rPr>
                 <w:sz w:val="17"/>
               </w:rPr>
-              <w:t>1,133,246</w:t>
+              <w:t>1,061,652</w:t>
             </w:r>
           </w:p>
         </w:tc>
@@ -816,7 +816,7 @@
               <w:rPr>
                 <w:sz w:val="17"/>
               </w:rPr>
-              <w:t>4</w:t>
+              <w:t>3</w:t>
             </w:r>
           </w:p>
         </w:tc>
@@ -829,7 +829,7 @@
               <w:rPr>
                 <w:sz w:val="17"/>
               </w:rPr>
-              <w:t>4.9701</w:t>
+              <w:t>4.0353</w:t>
             </w:r>
           </w:p>
         </w:tc>
@@ -842,7 +842,7 @@
               <w:rPr>
                 <w:sz w:val="17"/>
               </w:rPr>
-              <w:t>144.04</w:t>
+              <w:t>56.56</w:t>
             </w:r>
           </w:p>
         </w:tc>
@@ -855,7 +855,7 @@
               <w:rPr>
                 <w:sz w:val="17"/>
               </w:rPr>
-              <w:t>18.92%</w:t>
+              <w:t>20.55%</w:t>
             </w:r>
           </w:p>
         </w:tc>
@@ -868,7 +868,7 @@
               <w:rPr>
                 <w:sz w:val="17"/>
               </w:rPr>
-              <w:t>5.1361</w:t>
+              <w:t>4.0900</w:t>
             </w:r>
           </w:p>
         </w:tc>
@@ -881,7 +881,7 @@
               <w:rPr>
                 <w:sz w:val="17"/>
               </w:rPr>
-              <w:t>19.49%</w:t>
+              <w:t>22.53%</w:t>
             </w:r>
           </w:p>
         </w:tc>
@@ -894,7 +894,7 @@
               <w:rPr>
                 <w:sz w:val="17"/>
               </w:rPr>
-              <w:t>38.95%</w:t>
+              <w:t>46.51%</w:t>
             </w:r>
           </w:p>
         </w:tc>
@@ -1043,7 +1043,7 @@
               <w:rPr>
                 <w:sz w:val="17"/>
               </w:rPr>
-              <w:t>0.507</w:t>
+              <w:t>0.517</w:t>
             </w:r>
           </w:p>
         </w:tc>
@@ -1056,7 +1056,7 @@
               <w:rPr>
                 <w:sz w:val="17"/>
               </w:rPr>
-              <w:t>0.701</w:t>
+              <w:t>0.674</w:t>
             </w:r>
           </w:p>
         </w:tc>
@@ -1069,7 +1069,7 @@
               <w:rPr>
                 <w:sz w:val="17"/>
               </w:rPr>
-              <w:t>18.7%</w:t>
+              <w:t>23.7%</w:t>
             </w:r>
           </w:p>
         </w:tc>
@@ -1082,7 +1082,7 @@
               <w:rPr>
                 <w:sz w:val="17"/>
               </w:rPr>
-              <w:t>4–6 words</w:t>
+              <w:t>0–6 words</w:t>
             </w:r>
           </w:p>
         </w:tc>
@@ -1095,7 +1095,7 @@
               <w:rPr>
                 <w:sz w:val="17"/>
               </w:rPr>
-              <w:t>Grammatically strict; repetitive phrasing traps</w:t>
+              <w:t>Grammatically strict; prone to repetitive loops</w:t>
             </w:r>
           </w:p>
         </w:tc>
@@ -1124,7 +1124,7 @@
               <w:rPr>
                 <w:sz w:val="17"/>
               </w:rPr>
-              <w:t>0.679</w:t>
+              <w:t>0.678</w:t>
             </w:r>
           </w:p>
         </w:tc>
@@ -1137,7 +1137,7 @@
               <w:rPr>
                 <w:sz w:val="17"/>
               </w:rPr>
-              <w:t>0.878</w:t>
+              <w:t>0.900</w:t>
             </w:r>
           </w:p>
         </w:tc>
@@ -1150,7 +1150,7 @@
               <w:rPr>
                 <w:sz w:val="17"/>
               </w:rPr>
-              <w:t>5.0%</w:t>
+              <w:t>3.0%</w:t>
             </w:r>
           </w:p>
         </w:tc>
@@ -1163,7 +1163,7 @@
               <w:rPr>
                 <w:sz w:val="17"/>
               </w:rPr>
-              <w:t>0–4 words</w:t>
+              <w:t>0 words</w:t>
             </w:r>
           </w:p>
         </w:tc>
@@ -1218,7 +1218,7 @@
               <w:rPr>
                 <w:sz w:val="17"/>
               </w:rPr>
-              <w:t>1.000</w:t>
+              <w:t>0.992</w:t>
             </w:r>
           </w:p>
         </w:tc>
@@ -1257,7 +1257,7 @@
               <w:rPr>
                 <w:sz w:val="17"/>
               </w:rPr>
-              <w:t>High lexical richness; slight syntactic drift across clauses</w:t>
+              <w:t>High vocabulary variety; occasional grammatical drift</w:t>
             </w:r>
           </w:p>
         </w:tc>
@@ -1286,7 +1286,7 @@
               <w:rPr>
                 <w:sz w:val="17"/>
               </w:rPr>
-              <w:t>0.905</w:t>
+              <w:t>0.916</w:t>
             </w:r>
           </w:p>
         </w:tc>
@@ -1338,7 +1338,7 @@
               <w:rPr>
                 <w:sz w:val="17"/>
               </w:rPr>
-              <w:t>Excessive entropy; random token sequence, ungrammatical</w:t>
+              <w:t>High entropy; syntactic fragmentation, loss of coherence</w:t>
             </w:r>
           </w:p>
         </w:tc>
@@ -1364,9 +1364,11 @@
     </w:p>
     <w:p>
       <w:r>
-        <w:t>• LSTM and GRU perform competitively as the top two architectures: GRU achieves the lowest validation loss (4.9701, PPL 144.04), while LSTM achieves the highest unseen test-set top-1 accuracy (19.68%) and top-5 accuracy (39.17%).</w:t>
+        <w:t>• LSTM achieves top performance across all quantitative evaluation criteria: lowest validation loss (3.9903, PPL 54.07), highest validation top-1 accuracy (21.87%), and highest held-out test top-1 accuracy (23.29%) and top-5 accuracy (47.23%).</w:t>
         <w:br/>
-        <w:t>• Bidirectional RNN: By properly concatenating the forward final state h_n[-2] and backward final state h_n[-1], BiRNN captures the complete sequence context. However, with 1,513,406 parameters it exhibits earlier overfitting (peaking at epoch 2) compared to unidirectional models.</w:t>
+        <w:t>• GRU follows closely in second place, achieving 20.55% validation and 22.53% test top-1 accuracy while utilizing fewer parameters (1,061,652).</w:t>
+        <w:br/>
+        <w:t>• Bidirectional RNN: By concatenating forward final state h_n[-2] and backward final state h_n[-1], BiRNN correctly encodes the complete input context. However, with 1,262,868 parameters it exhibits earlier overfitting (peaking at epoch 2) compared to causal unidirectional models.</w:t>
         <w:br/>
         <w:t>• Sampling Strategy: T = 0.5 provides the best empirical balance between lexical diversity (Distinct-1: ~0.68) and low phrase repetition (trigram repetition under 5%).</w:t>
       </w:r>

</xml_diff>

<commit_message>
Address AI review: update repo link, tailor temperature qualitative analysis, soften claims with single-seed limitation, fix train loss range, clean up internal files, and ensure all 11 notebook cells have outputs
</commit_message>
<xml_diff>
--- a/SakshamGupta_230911186_FGAI_Assignment2.docx
+++ b/SakshamGupta_230911186_FGAI_Assignment2.docx
@@ -220,7 +220,7 @@
                 <w:sz w:val="20"/>
                 <w:u w:val="single"/>
               </w:rPr>
-              <w:t>https://github.com/sakshamgupta/autoregressive-text-generation-fgai</w:t>
+              <w:t>https://github.com/Saksham-Gupta-GH/fgai-autoregressive-text-generation-alice</w:t>
             </w:r>
           </w:p>
         </w:tc>
@@ -1364,13 +1364,15 @@
     </w:p>
     <w:p>
       <w:r>
-        <w:t>• LSTM achieves top performance across all quantitative evaluation criteria: lowest validation loss (3.9903, PPL 54.07), highest validation top-1 accuracy (21.87%), and highest held-out test top-1 accuracy (23.29%) and top-5 accuracy (47.23%).</w:t>
+        <w:t>• LSTM edges ahead across evaluation metrics: lowest validation loss (3.9903, PPL 54.07), highest validation top-1 accuracy (21.87%), and highest held-out test top-1 accuracy (23.29%) and top-5 accuracy (47.23%).</w:t>
         <w:br/>
-        <w:t>• GRU follows closely in second place, achieving 20.55% validation and 22.53% test top-1 accuracy while utilizing fewer parameters (1,061,652).</w:t>
+        <w:t>• GRU performs closely behind in second place, achieving 20.55% validation and 22.53% test top-1 accuracy while utilizing 11% fewer parameters (1,061,652 vs. 1,193,236). Simple RNN remains competitive in loss (4.0741, PPL 58.80).</w:t>
+        <w:br/>
+        <w:t>• Statistical Evaluation &amp; Single-Seed Limitation: While all models were trained with SEED=42 to enforce strictly identical conditions, the 0.045 cross-entropy delta between LSTM and GRU falls within typical single-run variance. Multi-seed runs (3–5 seeds) with mean ± standard deviation reporting are recommended for production-scale validation.</w:t>
         <w:br/>
         <w:t>• Bidirectional RNN: By concatenating forward final state h_n[-2] and backward final state h_n[-1], BiRNN correctly encodes the complete input context. However, with 1,262,868 parameters it exhibits earlier overfitting (peaking at epoch 2) compared to causal unidirectional models.</w:t>
         <w:br/>
-        <w:t>• Sampling Strategy: T = 0.5 provides the best empirical balance between lexical diversity (Distinct-1: ~0.68) and low phrase repetition (trigram repetition under 5%).</w:t>
+        <w:t>• Sampling Strategy: T = 0.5 provides the optimal empirical balance between lexical diversity (Distinct-1: 0.60–0.73) and phrase stability, achieving low trigram repetition across models (LSTM: 5.0%, GRU: 0.0%, BiRNN: 1.0%, Simple RNN: 6.1%).</w:t>
       </w:r>
     </w:p>
     <w:sectPr>

</xml_diff>

<commit_message>
Polish PDF layout to single-page, clarify n=3 per cell, soften generation comparison claims, and update submission zip
</commit_message>
<xml_diff>
--- a/SakshamGupta_230911186_FGAI_Assignment2.docx
+++ b/SakshamGupta_230911186_FGAI_Assignment2.docx
@@ -915,7 +915,7 @@
           <w:color w:val="1E3C72"/>
           <w:sz w:val="26"/>
         </w:rPr>
-        <w:t>3. Cross-Model Temperature Analysis (Averaged Over Seeds)</w:t>
+        <w:t>3. Cross-Model Temperature Analysis (Averaged Over Models and Seed Prompts, n = 3 per cell)</w:t>
       </w:r>
     </w:p>
     <w:tbl>
@@ -1095,7 +1095,7 @@
               <w:rPr>
                 <w:sz w:val="17"/>
               </w:rPr>
-              <w:t>Grammatically strict; prone to repetitive loops</w:t>
+              <w:t>Strict syntax; prone to repetitive phrase traps (GRU 52.5%)</w:t>
             </w:r>
           </w:p>
         </w:tc>
@@ -1176,7 +1176,7 @@
               <w:rPr>
                 <w:sz w:val="17"/>
               </w:rPr>
-              <w:t>Optimal empirical trade-off: high diversity with fluent phrasing</w:t>
+              <w:t>Optimal empirical trade-off: high diversity with fluent dialogue; LSTM and GRU comparable</w:t>
             </w:r>
           </w:p>
         </w:tc>
@@ -1257,7 +1257,7 @@
               <w:rPr>
                 <w:sz w:val="17"/>
               </w:rPr>
-              <w:t>High vocabulary variety; occasional grammatical drift</w:t>
+              <w:t>High lexical variety; slight syntactic drift across clauses</w:t>
             </w:r>
           </w:p>
         </w:tc>
@@ -1338,7 +1338,7 @@
               <w:rPr>
                 <w:sz w:val="17"/>
               </w:rPr>
-              <w:t>High entropy; syntactic fragmentation, loss of coherence</w:t>
+              <w:t>High entropy; syntactic collapse into ungrammatical token salad</w:t>
             </w:r>
           </w:p>
         </w:tc>
@@ -1364,9 +1364,11 @@
     </w:p>
     <w:p>
       <w:r>
-        <w:t>• LSTM edges ahead across evaluation metrics: lowest validation loss (3.9903, PPL 54.07), highest validation top-1 accuracy (21.87%), and highest held-out test top-1 accuracy (23.29%) and top-5 accuracy (47.23%).</w:t>
+        <w:t>• LSTM edges ahead across next-word prediction metrics: lowest validation loss (3.9903, PPL 54.07), highest validation top-1 accuracy (21.87%), and highest held-out test top-1 accuracy (23.29%) and top-5 accuracy (47.23%).</w:t>
         <w:br/>
-        <w:t>• GRU performs closely behind in second place, achieving 20.55% validation and 22.53% test top-1 accuracy while utilizing 11% fewer parameters (1,061,652 vs. 1,193,236). Simple RNN remains competitive in loss (4.0741, PPL 58.80).</w:t>
+        <w:t>• GRU performs closely behind in second place (Val Loss 4.0353, Test Top-1 22.53%) with 11% fewer parameters (1,061,652 vs. 1,193,236). Simple RNN remains competitive in loss (4.0741, PPL 58.80).</w:t>
+        <w:br/>
+        <w:t>• For sequential generation, LSTM and GRU are comparable: GRU achieves 0.0% trigram repetition at T=0.5, while LSTM produces the most fluent story phrasing in our samples.</w:t>
         <w:br/>
         <w:t>• Statistical Evaluation &amp; Single-Seed Limitation: While all models were trained with SEED=42 to enforce strictly identical conditions, the 0.045 cross-entropy delta between LSTM and GRU falls within typical single-run variance. Multi-seed runs (3–5 seeds) with mean ± standard deviation reporting are recommended for production-scale validation.</w:t>
         <w:br/>

</xml_diff>

<commit_message>
Enhance README with badges, TOC, file tree, rubric matrix; add active hyperlinks to docx and 1-page PDF
</commit_message>
<xml_diff>
--- a/SakshamGupta_230911186_FGAI_Assignment2.docx
+++ b/SakshamGupta_230911186_FGAI_Assignment2.docx
@@ -183,14 +183,20 @@
           <w:p>
             <w:r>
               <w:rPr>
-                <w:color w:val="0066CC"/>
                 <w:sz w:val="20"/>
-                <w:u w:val="single"/>
               </w:rPr>
               <w:t>Alice's Adventures in Wonderland (Lewis Carroll)</w:t>
               <w:br/>
-              <w:t>https://www.gutenberg.org/files/11/11-0.txt</w:t>
             </w:r>
+            <w:hyperlink r:id="rId9">
+              <w:r>
+                <w:rPr>
+                  <w:color w:val="0066CC"/>
+                  <w:u w:val="single"/>
+                </w:rPr>
+                <w:t>https://www.gutenberg.org/files/11/11-0.txt</w:t>
+              </w:r>
+            </w:hyperlink>
           </w:p>
         </w:tc>
       </w:tr>
@@ -214,14 +220,15 @@
             <w:tcW w:type="dxa" w:w="6192"/>
           </w:tcPr>
           <w:p>
-            <w:r>
-              <w:rPr>
-                <w:color w:val="0066CC"/>
-                <w:sz w:val="20"/>
-                <w:u w:val="single"/>
-              </w:rPr>
-              <w:t>https://github.com/Saksham-Gupta-GH/fgai-autoregressive-text-generation-alice</w:t>
-            </w:r>
+            <w:hyperlink r:id="rId10">
+              <w:r>
+                <w:rPr>
+                  <w:color w:val="0066CC"/>
+                  <w:u w:val="single"/>
+                </w:rPr>
+                <w:t>https://github.com/Saksham-Gupta-GH/fgai-autoregressive-text-generation-alice</w:t>
+              </w:r>
+            </w:hyperlink>
           </w:p>
         </w:tc>
       </w:tr>

</xml_diff>

<commit_message>
Address AI review feedback: add MIT license, fix PDF table header, disclose 11.17% test UNK rate, add contextual consistency analysis
</commit_message>
<xml_diff>
--- a/SakshamGupta_230911186_FGAI_Assignment2.docx
+++ b/SakshamGupta_230911186_FGAI_Assignment2.docx
@@ -1371,11 +1371,11 @@
     </w:p>
     <w:p>
       <w:r>
-        <w:t>• LSTM edges ahead across next-word prediction metrics: lowest validation loss (3.9903, PPL 54.07), highest validation top-1 accuracy (21.87%), and highest held-out test top-1 accuracy (23.29%) and top-5 accuracy (47.23%).</w:t>
+        <w:t>• LSTM edges ahead across next-word prediction metrics: lowest validation loss (3.9903, PPL 54.07), highest validation top-1 accuracy (21.87%), and highest held-out test top-1 accuracy (23.29%) and top-5 accuracy (47.23%). Held-out test set targets contain 11.17% &lt;unk&gt; tokens due to fitting vocabulary strictly on train tokens (min_freq=2); reported accuracies reflect classification over the full vocabulary including &lt;unk&gt;.</w:t>
         <w:br/>
         <w:t>• GRU performs closely behind in second place (Val Loss 4.0353, Test Top-1 22.53%) with 11% fewer parameters (1,061,652 vs. 1,193,236). Simple RNN remains competitive in loss (4.0741, PPL 58.80).</w:t>
         <w:br/>
-        <w:t>• For sequential generation, LSTM and GRU are comparable: GRU achieves 0.0% trigram repetition at T=0.5, while LSTM produces the most fluent story phrasing in our samples.</w:t>
+        <w:t>• Contextual Consistency &amp; Generation Quality: Seed 1 evaluates canonical voice recall on opening text (train partition), while Seeds 2 &amp; 3 test generalization on courtroom dialogue (test partition). At T=0.5, LSTM and GRU achieve superior contextual consistency, preserving Carroll's dialogue tags ('the march hare said', 'cried the queen') and entity pairings without drift. GRU achieves 0.0% trigram repetition at T=0.5, while LSTM produces the most fluent story phrasing in our samples.</w:t>
         <w:br/>
         <w:t>• Statistical Evaluation &amp; Single-Seed Limitation: While all models were trained with SEED=42 to enforce strictly identical conditions, the 0.045 cross-entropy delta between LSTM and GRU falls within typical single-run variance. Multi-seed runs (3–5 seeds) with mean ± standard deviation reporting are recommended for production-scale validation.</w:t>
         <w:br/>

</xml_diff>

<commit_message>
Format title and section headings in solid black, preserving blue solely for hyperlinks
</commit_message>
<xml_diff>
--- a/SakshamGupta_230911186_FGAI_Assignment2.docx
+++ b/SakshamGupta_230911186_FGAI_Assignment2.docx
@@ -9,7 +9,7 @@
       <w:r>
         <w:rPr>
           <w:b/>
-          <w:color w:val="1E3C72"/>
+          <w:color w:val="000000"/>
           <w:sz w:val="32"/>
         </w:rPr>
         <w:t>FOUNDATIONS OF GENERATIVE AI (ICT4403)</w:t>
@@ -245,7 +245,7 @@
       <w:r>
         <w:rPr>
           <w:b/>
-          <w:color w:val="1E3C72"/>
+          <w:color w:val="000000"/>
           <w:sz w:val="26"/>
         </w:rPr>
         <w:t>1. System Overview &amp; Problem Statement</w:t>
@@ -274,7 +274,7 @@
       <w:r>
         <w:rPr>
           <w:b/>
-          <w:color w:val="1E3C72"/>
+          <w:color w:val="000000"/>
           <w:sz w:val="26"/>
         </w:rPr>
         <w:t>2. Quantitative Evaluation Summary (Best Epoch &amp; Test Set)</w:t>
@@ -919,7 +919,7 @@
       <w:r>
         <w:rPr>
           <w:b/>
-          <w:color w:val="1E3C72"/>
+          <w:color w:val="000000"/>
           <w:sz w:val="26"/>
         </w:rPr>
         <w:t>3. Cross-Model Temperature Analysis (Averaged Over Models and Seed Prompts, n = 3 per cell)</w:t>
@@ -1363,7 +1363,7 @@
       <w:r>
         <w:rPr>
           <w:b/>
-          <w:color w:val="1E3C72"/>
+          <w:color w:val="000000"/>
           <w:sz w:val="26"/>
         </w:rPr>
         <w:t>4. Conclusion &amp; Model Comparison</w:t>

</xml_diff>

<commit_message>
Align LMS submission document strictly with Step 3 cover sheet requirements with verbatim field labels
</commit_message>
<xml_diff>
--- a/SakshamGupta_230911186_FGAI_Assignment2.docx
+++ b/SakshamGupta_230911186_FGAI_Assignment2.docx
@@ -10,7 +10,7 @@
         <w:rPr>
           <w:b/>
           <w:color w:val="000000"/>
-          <w:sz w:val="32"/>
+          <w:sz w:val="30"/>
         </w:rPr>
         <w:t>FOUNDATIONS OF GENERATIVE AI (ICT4403)</w:t>
       </w:r>
@@ -21,18 +21,37 @@
       </w:pPr>
       <w:r>
         <w:rPr>
-          <w:i/>
+          <w:b/>
           <w:sz w:val="24"/>
         </w:rPr>
         <w:t>Assignment 2: Autoregressive Text Generation System</w:t>
         <w:br/>
-        <w:t>Comparative Study of Simple RNN, Bidirectional RNN, LSTM, and GRU</w:t>
+      </w:r>
+      <w:r>
+        <w:rPr>
+          <w:i/>
+          <w:sz w:val="20"/>
+        </w:rPr>
+        <w:t>Submission Document &amp; GitHub Repository Verification Sheet</w:t>
       </w:r>
     </w:p>
     <w:p>
       <w:pPr>
-        <w:spacing w:after="240"/>
+        <w:spacing w:after="160"/>
       </w:pPr>
+    </w:p>
+    <w:p>
+      <w:pPr>
+        <w:pStyle w:val="Heading1"/>
+      </w:pPr>
+      <w:r>
+        <w:rPr>
+          <w:b/>
+          <w:color w:val="000000"/>
+          <w:sz w:val="23"/>
+        </w:rPr>
+        <w:t>1. Required Submission Details (Step 3)</w:t>
+      </w:r>
     </w:p>
     <w:tbl>
       <w:tblPr>
@@ -42,19 +61,19 @@
         <w:tblLook w:firstColumn="1" w:firstRow="1" w:lastColumn="0" w:lastRow="0" w:noHBand="0" w:noVBand="1" w:val="04A0"/>
       </w:tblPr>
       <w:tblGrid>
-        <w:gridCol w:w="4680"/>
-        <w:gridCol w:w="4680"/>
+        <w:gridCol w:w="4968"/>
+        <w:gridCol w:w="4968"/>
       </w:tblGrid>
       <w:tr>
         <w:tc>
           <w:tcPr>
-            <w:tcW w:type="dxa" w:w="3168"/>
+            <w:tcW w:type="dxa" w:w="3600"/>
           </w:tcPr>
           <w:p>
             <w:r>
               <w:rPr>
                 <w:b/>
-                <w:sz w:val="20"/>
+                <w:sz w:val="19"/>
               </w:rPr>
               <w:t>Student Name</w:t>
             </w:r>
@@ -62,12 +81,12 @@
         </w:tc>
         <w:tc>
           <w:tcPr>
-            <w:tcW w:type="dxa" w:w="6192"/>
+            <w:tcW w:type="dxa" w:w="6336"/>
           </w:tcPr>
           <w:p>
             <w:r>
               <w:rPr>
-                <w:sz w:val="20"/>
+                <w:sz w:val="19"/>
               </w:rPr>
               <w:t>Saksham Gupta</w:t>
             </w:r>
@@ -77,13 +96,13 @@
       <w:tr>
         <w:tc>
           <w:tcPr>
-            <w:tcW w:type="dxa" w:w="3168"/>
+            <w:tcW w:type="dxa" w:w="3600"/>
           </w:tcPr>
           <w:p>
             <w:r>
               <w:rPr>
                 <w:b/>
-                <w:sz w:val="20"/>
+                <w:sz w:val="19"/>
               </w:rPr>
               <w:t>Registration Number</w:t>
             </w:r>
@@ -91,12 +110,12 @@
         </w:tc>
         <w:tc>
           <w:tcPr>
-            <w:tcW w:type="dxa" w:w="6192"/>
+            <w:tcW w:type="dxa" w:w="6336"/>
           </w:tcPr>
           <w:p>
             <w:r>
               <w:rPr>
-                <w:sz w:val="20"/>
+                <w:sz w:val="19"/>
               </w:rPr>
               <w:t>230911186</w:t>
             </w:r>
@@ -106,13 +125,13 @@
       <w:tr>
         <w:tc>
           <w:tcPr>
-            <w:tcW w:type="dxa" w:w="3168"/>
+            <w:tcW w:type="dxa" w:w="3600"/>
           </w:tcPr>
           <w:p>
             <w:r>
               <w:rPr>
                 <w:b/>
-                <w:sz w:val="20"/>
+                <w:sz w:val="19"/>
               </w:rPr>
               <w:t>Assignment Title</w:t>
             </w:r>
@@ -120,14 +139,14 @@
         </w:tc>
         <w:tc>
           <w:tcPr>
-            <w:tcW w:type="dxa" w:w="6192"/>
+            <w:tcW w:type="dxa" w:w="6336"/>
           </w:tcPr>
           <w:p>
             <w:r>
               <w:rPr>
-                <w:sz w:val="20"/>
+                <w:sz w:val="19"/>
               </w:rPr>
-              <w:t>Assignment 2 - Autoregressive Text Generation System</w:t>
+              <w:t>Foundations of Generative AI (ICT4403) — Assignment 2</w:t>
             </w:r>
           </w:p>
         </w:tc>
@@ -135,28 +154,28 @@
       <w:tr>
         <w:tc>
           <w:tcPr>
-            <w:tcW w:type="dxa" w:w="3168"/>
+            <w:tcW w:type="dxa" w:w="3600"/>
           </w:tcPr>
           <w:p>
             <w:r>
               <w:rPr>
                 <w:b/>
-                <w:sz w:val="20"/>
+                <w:sz w:val="19"/>
               </w:rPr>
-              <w:t>System Title</w:t>
+              <w:t>Title of the Developed Autoregressive Text-Generation System</w:t>
             </w:r>
           </w:p>
         </w:tc>
         <w:tc>
           <w:tcPr>
-            <w:tcW w:type="dxa" w:w="6192"/>
+            <w:tcW w:type="dxa" w:w="6336"/>
           </w:tcPr>
           <w:p>
             <w:r>
               <w:rPr>
-                <w:sz w:val="20"/>
+                <w:sz w:val="19"/>
               </w:rPr>
-              <w:t>Comparative Word-Level Autoregressive Text Generation on Lewis Carroll's Alice in Wonderland using Simple RNN, Bidirectional RNN, LSTM and GRU</w:t>
+              <w:t>Comparative Word-Level Autoregressive Text Generation on Lewis Carroll's Alice's Adventures in Wonderland using Simple RNN, Bidirectional RNN, LSTM, and GRU</w:t>
             </w:r>
           </w:p>
         </w:tc>
@@ -164,29 +183,30 @@
       <w:tr>
         <w:tc>
           <w:tcPr>
-            <w:tcW w:type="dxa" w:w="3168"/>
+            <w:tcW w:type="dxa" w:w="3600"/>
           </w:tcPr>
           <w:p>
             <w:r>
               <w:rPr>
                 <w:b/>
-                <w:sz w:val="20"/>
+                <w:sz w:val="19"/>
               </w:rPr>
-              <w:t>Dataset Name &amp; Source</w:t>
+              <w:t>Name and Link of the Dataset Used</w:t>
             </w:r>
           </w:p>
         </w:tc>
         <w:tc>
           <w:tcPr>
-            <w:tcW w:type="dxa" w:w="6192"/>
+            <w:tcW w:type="dxa" w:w="6336"/>
           </w:tcPr>
           <w:p>
             <w:r>
               <w:rPr>
-                <w:sz w:val="20"/>
+                <w:sz w:val="19"/>
               </w:rPr>
-              <w:t>Alice's Adventures in Wonderland (Lewis Carroll)</w:t>
+              <w:t>Alice's Adventures in Wonderland (Lewis Carroll, Project Gutenberg eBook #11)</w:t>
               <w:br/>
+              <w:t xml:space="preserve">Dataset Link: </w:t>
             </w:r>
             <w:hyperlink r:id="rId9">
               <w:r>
@@ -203,13 +223,13 @@
       <w:tr>
         <w:tc>
           <w:tcPr>
-            <w:tcW w:type="dxa" w:w="3168"/>
+            <w:tcW w:type="dxa" w:w="3600"/>
           </w:tcPr>
           <w:p>
             <w:r>
               <w:rPr>
                 <w:b/>
-                <w:sz w:val="20"/>
+                <w:sz w:val="19"/>
               </w:rPr>
               <w:t>GitHub Repository Link</w:t>
             </w:r>
@@ -217,9 +237,15 @@
         </w:tc>
         <w:tc>
           <w:tcPr>
-            <w:tcW w:type="dxa" w:w="6192"/>
+            <w:tcW w:type="dxa" w:w="6336"/>
           </w:tcPr>
           <w:p>
+            <w:r>
+              <w:rPr>
+                <w:sz w:val="19"/>
+              </w:rPr>
+              <w:t xml:space="preserve">Repository Link: </w:t>
+            </w:r>
             <w:hyperlink r:id="rId10">
               <w:r>
                 <w:rPr>
@@ -229,1124 +255,6 @@
                 <w:t>https://github.com/Saksham-Gupta-GH/fgai-autoregressive-text-generation-alice</w:t>
               </w:r>
             </w:hyperlink>
-          </w:p>
-        </w:tc>
-      </w:tr>
-    </w:tbl>
-    <w:p>
-      <w:pPr>
-        <w:spacing w:after="320"/>
-      </w:pPr>
-    </w:p>
-    <w:p>
-      <w:pPr>
-        <w:pStyle w:val="Heading1"/>
-      </w:pPr>
-      <w:r>
-        <w:rPr>
-          <w:b/>
-          <w:color w:val="000000"/>
-          <w:sz w:val="26"/>
-        </w:rPr>
-        <w:t>1. System Overview &amp; Problem Statement</w:t>
-      </w:r>
-    </w:p>
-    <w:p>
-      <w:r>
-        <w:t>This project implements, evaluates, and analyzes an autoregressive next-word language generation system. Four recurrent neural network architectures were implemented in PyTorch and evaluated under strictly comparable experimental conditions on Lewis Carroll's 'Alice's Adventures in Wonderland' corpus:</w:t>
-        <w:br/>
-        <w:t>• Simple RNN (Vanilla Elman recurrent network)</w:t>
-        <w:br/>
-        <w:t>• Bidirectional RNN (Concatenating forward final state h_n[-2] and backward final state h_n[-1])</w:t>
-        <w:br/>
-        <w:t>• LSTM (Long Short-Term Memory with forget, input, and output gates)</w:t>
-        <w:br/>
-        <w:t>• GRU (Gated Recurrent Unit with reset and update gates)</w:t>
-        <w:br/>
-        <w:br/>
-        <w:t>To eliminate data leakage, the corpus is split chronologically into 80% Train, 10% Validation, and 10% Test blocks, and the vocabulary is fitted solely on the training tokens (min_freq=2). Input sequences of length 6 predict the 7th token.</w:t>
-      </w:r>
-    </w:p>
-    <w:p>
-      <w:pPr>
-        <w:pStyle w:val="Heading1"/>
-      </w:pPr>
-      <w:r>
-        <w:rPr>
-          <w:b/>
-          <w:color w:val="000000"/>
-          <w:sz w:val="26"/>
-        </w:rPr>
-        <w:t>2. Quantitative Evaluation Summary (Best Epoch &amp; Test Set)</w:t>
-      </w:r>
-    </w:p>
-    <w:tbl>
-      <w:tblPr>
-        <w:tblW w:type="auto" w:w="0"/>
-        <w:jc w:val="center"/>
-        <w:tblLayout w:type="autofit"/>
-        <w:tblLook w:firstColumn="1" w:firstRow="1" w:lastColumn="0" w:lastRow="0" w:noHBand="0" w:noVBand="1" w:val="04A0"/>
-      </w:tblPr>
-      <w:tblGrid>
-        <w:gridCol w:w="1040"/>
-        <w:gridCol w:w="1040"/>
-        <w:gridCol w:w="1040"/>
-        <w:gridCol w:w="1040"/>
-        <w:gridCol w:w="1040"/>
-        <w:gridCol w:w="1040"/>
-        <w:gridCol w:w="1040"/>
-        <w:gridCol w:w="1040"/>
-        <w:gridCol w:w="1040"/>
-      </w:tblGrid>
-      <w:tr>
-        <w:tc>
-          <w:tcPr>
-            <w:tcW w:type="dxa" w:w="1040"/>
-          </w:tcPr>
-          <w:p>
-            <w:r>
-              <w:rPr>
-                <w:b/>
-                <w:sz w:val="17"/>
-              </w:rPr>
-              <w:t>Architecture</w:t>
-            </w:r>
-          </w:p>
-        </w:tc>
-        <w:tc>
-          <w:tcPr>
-            <w:tcW w:type="dxa" w:w="1040"/>
-          </w:tcPr>
-          <w:p>
-            <w:r>
-              <w:rPr>
-                <w:b/>
-                <w:sz w:val="17"/>
-              </w:rPr>
-              <w:t>Parameters</w:t>
-            </w:r>
-          </w:p>
-        </w:tc>
-        <w:tc>
-          <w:tcPr>
-            <w:tcW w:type="dxa" w:w="1040"/>
-          </w:tcPr>
-          <w:p>
-            <w:r>
-              <w:rPr>
-                <w:b/>
-                <w:sz w:val="17"/>
-              </w:rPr>
-              <w:t>Best Ep</w:t>
-            </w:r>
-          </w:p>
-        </w:tc>
-        <w:tc>
-          <w:tcPr>
-            <w:tcW w:type="dxa" w:w="1040"/>
-          </w:tcPr>
-          <w:p>
-            <w:r>
-              <w:rPr>
-                <w:b/>
-                <w:sz w:val="17"/>
-              </w:rPr>
-              <w:t>Val Loss</w:t>
-            </w:r>
-          </w:p>
-        </w:tc>
-        <w:tc>
-          <w:tcPr>
-            <w:tcW w:type="dxa" w:w="1040"/>
-          </w:tcPr>
-          <w:p>
-            <w:r>
-              <w:rPr>
-                <w:b/>
-                <w:sz w:val="17"/>
-              </w:rPr>
-              <w:t>Val PPL</w:t>
-            </w:r>
-          </w:p>
-        </w:tc>
-        <w:tc>
-          <w:tcPr>
-            <w:tcW w:type="dxa" w:w="1040"/>
-          </w:tcPr>
-          <w:p>
-            <w:r>
-              <w:rPr>
-                <w:b/>
-                <w:sz w:val="17"/>
-              </w:rPr>
-              <w:t>Val Top-1</w:t>
-            </w:r>
-          </w:p>
-        </w:tc>
-        <w:tc>
-          <w:tcPr>
-            <w:tcW w:type="dxa" w:w="1040"/>
-          </w:tcPr>
-          <w:p>
-            <w:r>
-              <w:rPr>
-                <w:b/>
-                <w:sz w:val="17"/>
-              </w:rPr>
-              <w:t>Test Loss</w:t>
-            </w:r>
-          </w:p>
-        </w:tc>
-        <w:tc>
-          <w:tcPr>
-            <w:tcW w:type="dxa" w:w="1040"/>
-          </w:tcPr>
-          <w:p>
-            <w:r>
-              <w:rPr>
-                <w:b/>
-                <w:sz w:val="17"/>
-              </w:rPr>
-              <w:t>Test Top-1</w:t>
-            </w:r>
-          </w:p>
-        </w:tc>
-        <w:tc>
-          <w:tcPr>
-            <w:tcW w:type="dxa" w:w="1040"/>
-          </w:tcPr>
-          <w:p>
-            <w:r>
-              <w:rPr>
-                <w:b/>
-                <w:sz w:val="17"/>
-              </w:rPr>
-              <w:t>Test Top-5</w:t>
-            </w:r>
-          </w:p>
-        </w:tc>
-      </w:tr>
-      <w:tr>
-        <w:tc>
-          <w:tcPr>
-            <w:tcW w:type="dxa" w:w="1040"/>
-          </w:tcPr>
-          <w:p>
-            <w:r>
-              <w:rPr>
-                <w:b/>
-                <w:sz w:val="17"/>
-              </w:rPr>
-              <w:t>Simple RNN</w:t>
-            </w:r>
-          </w:p>
-        </w:tc>
-        <w:tc>
-          <w:tcPr>
-            <w:tcW w:type="dxa" w:w="1040"/>
-          </w:tcPr>
-          <w:p>
-            <w:r>
-              <w:rPr>
-                <w:sz w:val="17"/>
-              </w:rPr>
-              <w:t>798,484</w:t>
-            </w:r>
-          </w:p>
-        </w:tc>
-        <w:tc>
-          <w:tcPr>
-            <w:tcW w:type="dxa" w:w="1040"/>
-          </w:tcPr>
-          <w:p>
-            <w:r>
-              <w:rPr>
-                <w:sz w:val="17"/>
-              </w:rPr>
-              <w:t>4</w:t>
-            </w:r>
-          </w:p>
-        </w:tc>
-        <w:tc>
-          <w:tcPr>
-            <w:tcW w:type="dxa" w:w="1040"/>
-          </w:tcPr>
-          <w:p>
-            <w:r>
-              <w:rPr>
-                <w:sz w:val="17"/>
-              </w:rPr>
-              <w:t>4.0741</w:t>
-            </w:r>
-          </w:p>
-        </w:tc>
-        <w:tc>
-          <w:tcPr>
-            <w:tcW w:type="dxa" w:w="1040"/>
-          </w:tcPr>
-          <w:p>
-            <w:r>
-              <w:rPr>
-                <w:sz w:val="17"/>
-              </w:rPr>
-              <w:t>58.80</w:t>
-            </w:r>
-          </w:p>
-        </w:tc>
-        <w:tc>
-          <w:tcPr>
-            <w:tcW w:type="dxa" w:w="1040"/>
-          </w:tcPr>
-          <w:p>
-            <w:r>
-              <w:rPr>
-                <w:sz w:val="17"/>
-              </w:rPr>
-              <w:t>19.73%</w:t>
-            </w:r>
-          </w:p>
-        </w:tc>
-        <w:tc>
-          <w:tcPr>
-            <w:tcW w:type="dxa" w:w="1040"/>
-          </w:tcPr>
-          <w:p>
-            <w:r>
-              <w:rPr>
-                <w:sz w:val="17"/>
-              </w:rPr>
-              <w:t>4.1584</w:t>
-            </w:r>
-          </w:p>
-        </w:tc>
-        <w:tc>
-          <w:tcPr>
-            <w:tcW w:type="dxa" w:w="1040"/>
-          </w:tcPr>
-          <w:p>
-            <w:r>
-              <w:rPr>
-                <w:sz w:val="17"/>
-              </w:rPr>
-              <w:t>20.80%</w:t>
-            </w:r>
-          </w:p>
-        </w:tc>
-        <w:tc>
-          <w:tcPr>
-            <w:tcW w:type="dxa" w:w="1040"/>
-          </w:tcPr>
-          <w:p>
-            <w:r>
-              <w:rPr>
-                <w:sz w:val="17"/>
-              </w:rPr>
-              <w:t>45.28%</w:t>
-            </w:r>
-          </w:p>
-        </w:tc>
-      </w:tr>
-      <w:tr>
-        <w:tc>
-          <w:tcPr>
-            <w:tcW w:type="dxa" w:w="1040"/>
-          </w:tcPr>
-          <w:p>
-            <w:r>
-              <w:rPr>
-                <w:b/>
-                <w:sz w:val="17"/>
-              </w:rPr>
-              <w:t>Bidirectional RNN</w:t>
-            </w:r>
-          </w:p>
-        </w:tc>
-        <w:tc>
-          <w:tcPr>
-            <w:tcW w:type="dxa" w:w="1040"/>
-          </w:tcPr>
-          <w:p>
-            <w:r>
-              <w:rPr>
-                <w:sz w:val="17"/>
-              </w:rPr>
-              <w:t>1,262,868</w:t>
-            </w:r>
-          </w:p>
-        </w:tc>
-        <w:tc>
-          <w:tcPr>
-            <w:tcW w:type="dxa" w:w="1040"/>
-          </w:tcPr>
-          <w:p>
-            <w:r>
-              <w:rPr>
-                <w:sz w:val="17"/>
-              </w:rPr>
-              <w:t>2</w:t>
-            </w:r>
-          </w:p>
-        </w:tc>
-        <w:tc>
-          <w:tcPr>
-            <w:tcW w:type="dxa" w:w="1040"/>
-          </w:tcPr>
-          <w:p>
-            <w:r>
-              <w:rPr>
-                <w:sz w:val="17"/>
-              </w:rPr>
-              <w:t>4.2804</w:t>
-            </w:r>
-          </w:p>
-        </w:tc>
-        <w:tc>
-          <w:tcPr>
-            <w:tcW w:type="dxa" w:w="1040"/>
-          </w:tcPr>
-          <w:p>
-            <w:r>
-              <w:rPr>
-                <w:sz w:val="17"/>
-              </w:rPr>
-              <w:t>72.27</w:t>
-            </w:r>
-          </w:p>
-        </w:tc>
-        <w:tc>
-          <w:tcPr>
-            <w:tcW w:type="dxa" w:w="1040"/>
-          </w:tcPr>
-          <w:p>
-            <w:r>
-              <w:rPr>
-                <w:sz w:val="17"/>
-              </w:rPr>
-              <w:t>18.66%</w:t>
-            </w:r>
-          </w:p>
-        </w:tc>
-        <w:tc>
-          <w:tcPr>
-            <w:tcW w:type="dxa" w:w="1040"/>
-          </w:tcPr>
-          <w:p>
-            <w:r>
-              <w:rPr>
-                <w:sz w:val="17"/>
-              </w:rPr>
-              <w:t>4.3192</w:t>
-            </w:r>
-          </w:p>
-        </w:tc>
-        <w:tc>
-          <w:tcPr>
-            <w:tcW w:type="dxa" w:w="1040"/>
-          </w:tcPr>
-          <w:p>
-            <w:r>
-              <w:rPr>
-                <w:sz w:val="17"/>
-              </w:rPr>
-              <w:t>18.47%</w:t>
-            </w:r>
-          </w:p>
-        </w:tc>
-        <w:tc>
-          <w:tcPr>
-            <w:tcW w:type="dxa" w:w="1040"/>
-          </w:tcPr>
-          <w:p>
-            <w:r>
-              <w:rPr>
-                <w:sz w:val="17"/>
-              </w:rPr>
-              <w:t>42.26%</w:t>
-            </w:r>
-          </w:p>
-        </w:tc>
-      </w:tr>
-      <w:tr>
-        <w:tc>
-          <w:tcPr>
-            <w:tcW w:type="dxa" w:w="1040"/>
-          </w:tcPr>
-          <w:p>
-            <w:r>
-              <w:rPr>
-                <w:b/>
-                <w:sz w:val="17"/>
-              </w:rPr>
-              <w:t>LSTM</w:t>
-            </w:r>
-          </w:p>
-        </w:tc>
-        <w:tc>
-          <w:tcPr>
-            <w:tcW w:type="dxa" w:w="1040"/>
-          </w:tcPr>
-          <w:p>
-            <w:r>
-              <w:rPr>
-                <w:sz w:val="17"/>
-              </w:rPr>
-              <w:t>1,193,236</w:t>
-            </w:r>
-          </w:p>
-        </w:tc>
-        <w:tc>
-          <w:tcPr>
-            <w:tcW w:type="dxa" w:w="1040"/>
-          </w:tcPr>
-          <w:p>
-            <w:r>
-              <w:rPr>
-                <w:sz w:val="17"/>
-              </w:rPr>
-              <w:t>5</w:t>
-            </w:r>
-          </w:p>
-        </w:tc>
-        <w:tc>
-          <w:tcPr>
-            <w:tcW w:type="dxa" w:w="1040"/>
-          </w:tcPr>
-          <w:p>
-            <w:r>
-              <w:rPr>
-                <w:sz w:val="17"/>
-              </w:rPr>
-              <w:t>3.9903</w:t>
-            </w:r>
-          </w:p>
-        </w:tc>
-        <w:tc>
-          <w:tcPr>
-            <w:tcW w:type="dxa" w:w="1040"/>
-          </w:tcPr>
-          <w:p>
-            <w:r>
-              <w:rPr>
-                <w:sz w:val="17"/>
-              </w:rPr>
-              <w:t>54.07</w:t>
-            </w:r>
-          </w:p>
-        </w:tc>
-        <w:tc>
-          <w:tcPr>
-            <w:tcW w:type="dxa" w:w="1040"/>
-          </w:tcPr>
-          <w:p>
-            <w:r>
-              <w:rPr>
-                <w:sz w:val="17"/>
-              </w:rPr>
-              <w:t>21.87%</w:t>
-            </w:r>
-          </w:p>
-        </w:tc>
-        <w:tc>
-          <w:tcPr>
-            <w:tcW w:type="dxa" w:w="1040"/>
-          </w:tcPr>
-          <w:p>
-            <w:r>
-              <w:rPr>
-                <w:sz w:val="17"/>
-              </w:rPr>
-              <w:t>4.0576</w:t>
-            </w:r>
-          </w:p>
-        </w:tc>
-        <w:tc>
-          <w:tcPr>
-            <w:tcW w:type="dxa" w:w="1040"/>
-          </w:tcPr>
-          <w:p>
-            <w:r>
-              <w:rPr>
-                <w:sz w:val="17"/>
-              </w:rPr>
-              <w:t>23.29%</w:t>
-            </w:r>
-          </w:p>
-        </w:tc>
-        <w:tc>
-          <w:tcPr>
-            <w:tcW w:type="dxa" w:w="1040"/>
-          </w:tcPr>
-          <w:p>
-            <w:r>
-              <w:rPr>
-                <w:sz w:val="17"/>
-              </w:rPr>
-              <w:t>47.23%</w:t>
-            </w:r>
-          </w:p>
-        </w:tc>
-      </w:tr>
-      <w:tr>
-        <w:tc>
-          <w:tcPr>
-            <w:tcW w:type="dxa" w:w="1040"/>
-          </w:tcPr>
-          <w:p>
-            <w:r>
-              <w:rPr>
-                <w:b/>
-                <w:sz w:val="17"/>
-              </w:rPr>
-              <w:t>GRU</w:t>
-            </w:r>
-          </w:p>
-        </w:tc>
-        <w:tc>
-          <w:tcPr>
-            <w:tcW w:type="dxa" w:w="1040"/>
-          </w:tcPr>
-          <w:p>
-            <w:r>
-              <w:rPr>
-                <w:sz w:val="17"/>
-              </w:rPr>
-              <w:t>1,061,652</w:t>
-            </w:r>
-          </w:p>
-        </w:tc>
-        <w:tc>
-          <w:tcPr>
-            <w:tcW w:type="dxa" w:w="1040"/>
-          </w:tcPr>
-          <w:p>
-            <w:r>
-              <w:rPr>
-                <w:sz w:val="17"/>
-              </w:rPr>
-              <w:t>3</w:t>
-            </w:r>
-          </w:p>
-        </w:tc>
-        <w:tc>
-          <w:tcPr>
-            <w:tcW w:type="dxa" w:w="1040"/>
-          </w:tcPr>
-          <w:p>
-            <w:r>
-              <w:rPr>
-                <w:sz w:val="17"/>
-              </w:rPr>
-              <w:t>4.0353</w:t>
-            </w:r>
-          </w:p>
-        </w:tc>
-        <w:tc>
-          <w:tcPr>
-            <w:tcW w:type="dxa" w:w="1040"/>
-          </w:tcPr>
-          <w:p>
-            <w:r>
-              <w:rPr>
-                <w:sz w:val="17"/>
-              </w:rPr>
-              <w:t>56.56</w:t>
-            </w:r>
-          </w:p>
-        </w:tc>
-        <w:tc>
-          <w:tcPr>
-            <w:tcW w:type="dxa" w:w="1040"/>
-          </w:tcPr>
-          <w:p>
-            <w:r>
-              <w:rPr>
-                <w:sz w:val="17"/>
-              </w:rPr>
-              <w:t>20.55%</w:t>
-            </w:r>
-          </w:p>
-        </w:tc>
-        <w:tc>
-          <w:tcPr>
-            <w:tcW w:type="dxa" w:w="1040"/>
-          </w:tcPr>
-          <w:p>
-            <w:r>
-              <w:rPr>
-                <w:sz w:val="17"/>
-              </w:rPr>
-              <w:t>4.0900</w:t>
-            </w:r>
-          </w:p>
-        </w:tc>
-        <w:tc>
-          <w:tcPr>
-            <w:tcW w:type="dxa" w:w="1040"/>
-          </w:tcPr>
-          <w:p>
-            <w:r>
-              <w:rPr>
-                <w:sz w:val="17"/>
-              </w:rPr>
-              <w:t>22.53%</w:t>
-            </w:r>
-          </w:p>
-        </w:tc>
-        <w:tc>
-          <w:tcPr>
-            <w:tcW w:type="dxa" w:w="1040"/>
-          </w:tcPr>
-          <w:p>
-            <w:r>
-              <w:rPr>
-                <w:sz w:val="17"/>
-              </w:rPr>
-              <w:t>46.51%</w:t>
-            </w:r>
-          </w:p>
-        </w:tc>
-      </w:tr>
-    </w:tbl>
-    <w:p>
-      <w:pPr>
-        <w:spacing w:after="280"/>
-      </w:pPr>
-    </w:p>
-    <w:p>
-      <w:pPr>
-        <w:pStyle w:val="Heading1"/>
-      </w:pPr>
-      <w:r>
-        <w:rPr>
-          <w:b/>
-          <w:color w:val="000000"/>
-          <w:sz w:val="26"/>
-        </w:rPr>
-        <w:t>3. Cross-Model Temperature Analysis (Averaged Over Models and Seed Prompts, n = 3 per cell)</w:t>
-      </w:r>
-    </w:p>
-    <w:tbl>
-      <w:tblPr>
-        <w:tblW w:type="auto" w:w="0"/>
-        <w:jc w:val="center"/>
-        <w:tblLayout w:type="autofit"/>
-        <w:tblLook w:firstColumn="1" w:firstRow="1" w:lastColumn="0" w:lastRow="0" w:noHBand="0" w:noVBand="1" w:val="04A0"/>
-      </w:tblPr>
-      <w:tblGrid>
-        <w:gridCol w:w="1560"/>
-        <w:gridCol w:w="1560"/>
-        <w:gridCol w:w="1560"/>
-        <w:gridCol w:w="1560"/>
-        <w:gridCol w:w="1560"/>
-        <w:gridCol w:w="1560"/>
-      </w:tblGrid>
-      <w:tr>
-        <w:tc>
-          <w:tcPr>
-            <w:tcW w:type="dxa" w:w="1560"/>
-          </w:tcPr>
-          <w:p>
-            <w:r>
-              <w:rPr>
-                <w:b/>
-                <w:sz w:val="17"/>
-              </w:rPr>
-              <w:t>Temperature (T)</w:t>
-            </w:r>
-          </w:p>
-        </w:tc>
-        <w:tc>
-          <w:tcPr>
-            <w:tcW w:type="dxa" w:w="1560"/>
-          </w:tcPr>
-          <w:p>
-            <w:r>
-              <w:rPr>
-                <w:b/>
-                <w:sz w:val="17"/>
-              </w:rPr>
-              <w:t>Distinct-1</w:t>
-            </w:r>
-          </w:p>
-        </w:tc>
-        <w:tc>
-          <w:tcPr>
-            <w:tcW w:type="dxa" w:w="1560"/>
-          </w:tcPr>
-          <w:p>
-            <w:r>
-              <w:rPr>
-                <w:b/>
-                <w:sz w:val="17"/>
-              </w:rPr>
-              <w:t>Distinct-2</w:t>
-            </w:r>
-          </w:p>
-        </w:tc>
-        <w:tc>
-          <w:tcPr>
-            <w:tcW w:type="dxa" w:w="1560"/>
-          </w:tcPr>
-          <w:p>
-            <w:r>
-              <w:rPr>
-                <w:b/>
-                <w:sz w:val="17"/>
-              </w:rPr>
-              <w:t>Trigram Repetition</w:t>
-            </w:r>
-          </w:p>
-        </w:tc>
-        <w:tc>
-          <w:tcPr>
-            <w:tcW w:type="dxa" w:w="1560"/>
-          </w:tcPr>
-          <w:p>
-            <w:r>
-              <w:rPr>
-                <w:b/>
-                <w:sz w:val="17"/>
-              </w:rPr>
-              <w:t>Longest Loop</w:t>
-            </w:r>
-          </w:p>
-        </w:tc>
-        <w:tc>
-          <w:tcPr>
-            <w:tcW w:type="dxa" w:w="1560"/>
-          </w:tcPr>
-          <w:p>
-            <w:r>
-              <w:rPr>
-                <w:b/>
-                <w:sz w:val="17"/>
-              </w:rPr>
-              <w:t>Empirical Quality</w:t>
-            </w:r>
-          </w:p>
-        </w:tc>
-      </w:tr>
-      <w:tr>
-        <w:tc>
-          <w:tcPr>
-            <w:tcW w:type="dxa" w:w="1560"/>
-          </w:tcPr>
-          <w:p>
-            <w:r>
-              <w:rPr>
-                <w:b/>
-                <w:sz w:val="17"/>
-              </w:rPr>
-              <w:t>T = 0.2</w:t>
-            </w:r>
-          </w:p>
-        </w:tc>
-        <w:tc>
-          <w:tcPr>
-            <w:tcW w:type="dxa" w:w="1560"/>
-          </w:tcPr>
-          <w:p>
-            <w:r>
-              <w:rPr>
-                <w:sz w:val="17"/>
-              </w:rPr>
-              <w:t>0.517</w:t>
-            </w:r>
-          </w:p>
-        </w:tc>
-        <w:tc>
-          <w:tcPr>
-            <w:tcW w:type="dxa" w:w="1560"/>
-          </w:tcPr>
-          <w:p>
-            <w:r>
-              <w:rPr>
-                <w:sz w:val="17"/>
-              </w:rPr>
-              <w:t>0.674</w:t>
-            </w:r>
-          </w:p>
-        </w:tc>
-        <w:tc>
-          <w:tcPr>
-            <w:tcW w:type="dxa" w:w="1560"/>
-          </w:tcPr>
-          <w:p>
-            <w:r>
-              <w:rPr>
-                <w:sz w:val="17"/>
-              </w:rPr>
-              <w:t>23.7%</w:t>
-            </w:r>
-          </w:p>
-        </w:tc>
-        <w:tc>
-          <w:tcPr>
-            <w:tcW w:type="dxa" w:w="1560"/>
-          </w:tcPr>
-          <w:p>
-            <w:r>
-              <w:rPr>
-                <w:sz w:val="17"/>
-              </w:rPr>
-              <w:t>0–6 words</w:t>
-            </w:r>
-          </w:p>
-        </w:tc>
-        <w:tc>
-          <w:tcPr>
-            <w:tcW w:type="dxa" w:w="1560"/>
-          </w:tcPr>
-          <w:p>
-            <w:r>
-              <w:rPr>
-                <w:sz w:val="17"/>
-              </w:rPr>
-              <w:t>Strict syntax; prone to repetitive phrase traps (GRU 52.5%)</w:t>
-            </w:r>
-          </w:p>
-        </w:tc>
-      </w:tr>
-      <w:tr>
-        <w:tc>
-          <w:tcPr>
-            <w:tcW w:type="dxa" w:w="1560"/>
-          </w:tcPr>
-          <w:p>
-            <w:r>
-              <w:rPr>
-                <w:b/>
-                <w:sz w:val="17"/>
-              </w:rPr>
-              <w:t>T = 0.5</w:t>
-            </w:r>
-          </w:p>
-        </w:tc>
-        <w:tc>
-          <w:tcPr>
-            <w:tcW w:type="dxa" w:w="1560"/>
-          </w:tcPr>
-          <w:p>
-            <w:r>
-              <w:rPr>
-                <w:sz w:val="17"/>
-              </w:rPr>
-              <w:t>0.678</w:t>
-            </w:r>
-          </w:p>
-        </w:tc>
-        <w:tc>
-          <w:tcPr>
-            <w:tcW w:type="dxa" w:w="1560"/>
-          </w:tcPr>
-          <w:p>
-            <w:r>
-              <w:rPr>
-                <w:sz w:val="17"/>
-              </w:rPr>
-              <w:t>0.900</w:t>
-            </w:r>
-          </w:p>
-        </w:tc>
-        <w:tc>
-          <w:tcPr>
-            <w:tcW w:type="dxa" w:w="1560"/>
-          </w:tcPr>
-          <w:p>
-            <w:r>
-              <w:rPr>
-                <w:sz w:val="17"/>
-              </w:rPr>
-              <w:t>3.0%</w:t>
-            </w:r>
-          </w:p>
-        </w:tc>
-        <w:tc>
-          <w:tcPr>
-            <w:tcW w:type="dxa" w:w="1560"/>
-          </w:tcPr>
-          <w:p>
-            <w:r>
-              <w:rPr>
-                <w:sz w:val="17"/>
-              </w:rPr>
-              <w:t>0 words</w:t>
-            </w:r>
-          </w:p>
-        </w:tc>
-        <w:tc>
-          <w:tcPr>
-            <w:tcW w:type="dxa" w:w="1560"/>
-          </w:tcPr>
-          <w:p>
-            <w:r>
-              <w:rPr>
-                <w:sz w:val="17"/>
-              </w:rPr>
-              <w:t>Optimal empirical trade-off: high diversity with fluent dialogue; LSTM and GRU comparable</w:t>
-            </w:r>
-          </w:p>
-        </w:tc>
-      </w:tr>
-      <w:tr>
-        <w:tc>
-          <w:tcPr>
-            <w:tcW w:type="dxa" w:w="1560"/>
-          </w:tcPr>
-          <w:p>
-            <w:r>
-              <w:rPr>
-                <w:b/>
-                <w:sz w:val="17"/>
-              </w:rPr>
-              <w:t>T = 1.0</w:t>
-            </w:r>
-          </w:p>
-        </w:tc>
-        <w:tc>
-          <w:tcPr>
-            <w:tcW w:type="dxa" w:w="1560"/>
-          </w:tcPr>
-          <w:p>
-            <w:r>
-              <w:rPr>
-                <w:sz w:val="17"/>
-              </w:rPr>
-              <w:t>0.855</w:t>
-            </w:r>
-          </w:p>
-        </w:tc>
-        <w:tc>
-          <w:tcPr>
-            <w:tcW w:type="dxa" w:w="1560"/>
-          </w:tcPr>
-          <w:p>
-            <w:r>
-              <w:rPr>
-                <w:sz w:val="17"/>
-              </w:rPr>
-              <w:t>0.992</w:t>
-            </w:r>
-          </w:p>
-        </w:tc>
-        <w:tc>
-          <w:tcPr>
-            <w:tcW w:type="dxa" w:w="1560"/>
-          </w:tcPr>
-          <w:p>
-            <w:r>
-              <w:rPr>
-                <w:sz w:val="17"/>
-              </w:rPr>
-              <w:t>0.0%</w:t>
-            </w:r>
-          </w:p>
-        </w:tc>
-        <w:tc>
-          <w:tcPr>
-            <w:tcW w:type="dxa" w:w="1560"/>
-          </w:tcPr>
-          <w:p>
-            <w:r>
-              <w:rPr>
-                <w:sz w:val="17"/>
-              </w:rPr>
-              <w:t>0 words</w:t>
-            </w:r>
-          </w:p>
-        </w:tc>
-        <w:tc>
-          <w:tcPr>
-            <w:tcW w:type="dxa" w:w="1560"/>
-          </w:tcPr>
-          <w:p>
-            <w:r>
-              <w:rPr>
-                <w:sz w:val="17"/>
-              </w:rPr>
-              <w:t>High lexical variety; slight syntactic drift across clauses</w:t>
-            </w:r>
-          </w:p>
-        </w:tc>
-      </w:tr>
-      <w:tr>
-        <w:tc>
-          <w:tcPr>
-            <w:tcW w:type="dxa" w:w="1560"/>
-          </w:tcPr>
-          <w:p>
-            <w:r>
-              <w:rPr>
-                <w:b/>
-                <w:sz w:val="17"/>
-              </w:rPr>
-              <w:t>T = 1.5</w:t>
-            </w:r>
-          </w:p>
-        </w:tc>
-        <w:tc>
-          <w:tcPr>
-            <w:tcW w:type="dxa" w:w="1560"/>
-          </w:tcPr>
-          <w:p>
-            <w:r>
-              <w:rPr>
-                <w:sz w:val="17"/>
-              </w:rPr>
-              <w:t>0.916</w:t>
-            </w:r>
-          </w:p>
-        </w:tc>
-        <w:tc>
-          <w:tcPr>
-            <w:tcW w:type="dxa" w:w="1560"/>
-          </w:tcPr>
-          <w:p>
-            <w:r>
-              <w:rPr>
-                <w:sz w:val="17"/>
-              </w:rPr>
-              <w:t>1.000</w:t>
-            </w:r>
-          </w:p>
-        </w:tc>
-        <w:tc>
-          <w:tcPr>
-            <w:tcW w:type="dxa" w:w="1560"/>
-          </w:tcPr>
-          <w:p>
-            <w:r>
-              <w:rPr>
-                <w:sz w:val="17"/>
-              </w:rPr>
-              <w:t>0.0%</w:t>
-            </w:r>
-          </w:p>
-        </w:tc>
-        <w:tc>
-          <w:tcPr>
-            <w:tcW w:type="dxa" w:w="1560"/>
-          </w:tcPr>
-          <w:p>
-            <w:r>
-              <w:rPr>
-                <w:sz w:val="17"/>
-              </w:rPr>
-              <w:t>0 words</w:t>
-            </w:r>
-          </w:p>
-        </w:tc>
-        <w:tc>
-          <w:tcPr>
-            <w:tcW w:type="dxa" w:w="1560"/>
-          </w:tcPr>
-          <w:p>
-            <w:r>
-              <w:rPr>
-                <w:sz w:val="17"/>
-              </w:rPr>
-              <w:t>High entropy; syntactic collapse into ungrammatical token salad</w:t>
-            </w:r>
           </w:p>
         </w:tc>
       </w:tr>
@@ -1364,29 +272,185 @@
         <w:rPr>
           <w:b/>
           <w:color w:val="000000"/>
-          <w:sz w:val="26"/>
+          <w:sz w:val="23"/>
         </w:rPr>
-        <w:t>4. Conclusion &amp; Model Comparison</w:t>
+        <w:t>2. GitHub Repository Structure &amp; Verified Deliverables (Step 2)</w:t>
       </w:r>
     </w:p>
     <w:p>
+      <w:pPr>
+        <w:spacing w:after="80"/>
+      </w:pPr>
       <w:r>
-        <w:t>• LSTM edges ahead across next-word prediction metrics: lowest validation loss (3.9903, PPL 54.07), highest validation top-1 accuracy (21.87%), and highest held-out test top-1 accuracy (23.29%) and top-5 accuracy (47.23%). Held-out test set targets contain 11.17% &lt;unk&gt; tokens due to fitting vocabulary strictly on train tokens (min_freq=2); reported accuracies reflect classification over the full vocabulary including &lt;unk&gt;.</w:t>
-        <w:br/>
-        <w:t>• GRU performs closely behind in second place (Val Loss 4.0353, Test Top-1 22.53%) with 11% fewer parameters (1,061,652 vs. 1,193,236). Simple RNN remains competitive in loss (4.0741, PPL 58.80).</w:t>
-        <w:br/>
-        <w:t>• Contextual Consistency &amp; Seed Origin: Seed 1 comes from the training text, Seed 2 from held-out test text, and Seed 3 from validation text. Consistency was assessed qualitatively on a few samples per cell. At T=0.5, LSTM and GRU more often produce Carroll-style dialogue tags (e.g. 'the march hare said'), but all models drift across clauses and none sustain a consistent scene. We did not compute a quantitative consistency metric. GRU achieves 0.0% trigram repetition at T=0.5, while LSTM produces the most fluent story phrasing in our samples.</w:t>
-        <w:br/>
-        <w:t>• Statistical Evaluation &amp; Single-Seed Limitation: While all models were trained with SEED=42 to enforce strictly identical conditions, the 0.045 cross-entropy delta between LSTM and GRU falls within typical single-run variance. Multi-seed runs (3–5 seeds) with mean ± standard deviation reporting are recommended for production-scale validation.</w:t>
-        <w:br/>
-        <w:t>• Bidirectional RNN: By concatenating forward final state h_n[-2] and backward final state h_n[-1], BiRNN correctly encodes the complete input context. However, with 1,262,868 parameters it exhibits earlier overfitting (peaking at epoch 2) compared to causal unidirectional models.</w:t>
-        <w:br/>
-        <w:t>• Sampling Strategy: T = 0.5 provides the optimal empirical balance between lexical diversity (Distinct-1: 0.60–0.73) and phrase stability, achieving low trigram repetition across models (LSTM: 5.0%, GRU: 0.0%, BiRNN: 1.0%, Simple RNN: 6.1%).</w:t>
+        <w:t>All implementation code, pre-trained model checkpoints, interactive notebooks, plots, and experimental data are hosted in the public GitHub repository above in strict compliance with the assignment guidelines:</w:t>
+      </w:r>
+    </w:p>
+    <w:p>
+      <w:pPr>
+        <w:pStyle w:val="ListBullet"/>
+        <w:spacing w:after="60"/>
+      </w:pPr>
+      <w:r>
+        <w:rPr>
+          <w:b/>
+          <w:sz w:val="18"/>
+        </w:rPr>
+        <w:t xml:space="preserve">Complete Source Implementation (src/): </w:t>
+      </w:r>
+      <w:r>
+        <w:rPr>
+          <w:sz w:val="18"/>
+        </w:rPr>
+        <w:t>Modular PyTorch implementation containing preprocessing.py (chronological 80/10/10 split, train-only vocabulary fitting with min_freq=2), models.py (Simple RNN, BiRNN with [h_n[-2], h_n[-1]] state concatenation, LSTM, and GRU), train.py (training loop with validation checkpointing), evaluate.py (loss, perplexity, Top-1/Top-5 accuracy), and generate.py (temperature sampling, Distinct-1/2, trigram repetition metrics).</w:t>
+      </w:r>
+    </w:p>
+    <w:p>
+      <w:pPr>
+        <w:pStyle w:val="ListBullet"/>
+        <w:spacing w:after="60"/>
+      </w:pPr>
+      <w:r>
+        <w:rPr>
+          <w:b/>
+          <w:sz w:val="18"/>
+        </w:rPr>
+        <w:t xml:space="preserve">Interactive Jupyter Notebook (notebooks/text_generation_assignment2.ipynb): </w:t>
+      </w:r>
+      <w:r>
+        <w:rPr>
+          <w:sz w:val="18"/>
+        </w:rPr>
+        <w:t>Complete, fully executed notebook with all 11 cells containing data preparation, model training progress, evaluation plots, and generated text outputs.</w:t>
+      </w:r>
+    </w:p>
+    <w:p>
+      <w:pPr>
+        <w:pStyle w:val="ListBullet"/>
+        <w:spacing w:after="60"/>
+      </w:pPr>
+      <w:r>
+        <w:rPr>
+          <w:b/>
+          <w:sz w:val="18"/>
+        </w:rPr>
+        <w:t xml:space="preserve">Automated End-to-End Pipeline (run_experiments.py): </w:t>
+      </w:r>
+      <w:r>
+        <w:rPr>
+          <w:sz w:val="18"/>
+        </w:rPr>
+        <w:t>Single-command reproduction script executing the full experimental workflow: preprocessing, training, evaluation, plotting, and generation.</w:t>
+      </w:r>
+    </w:p>
+    <w:p>
+      <w:pPr>
+        <w:pStyle w:val="ListBullet"/>
+        <w:spacing w:after="60"/>
+      </w:pPr>
+      <w:r>
+        <w:rPr>
+          <w:b/>
+          <w:sz w:val="18"/>
+        </w:rPr>
+        <w:t xml:space="preserve">Empirical Results &amp; Visualizations (results/): </w:t>
+      </w:r>
+      <w:r>
+        <w:rPr>
+          <w:sz w:val="18"/>
+        </w:rPr>
+        <w:t>Tabular CSV reports, generated sample logs across temperatures (T ∈ {0.2, 0.5, 1.0, 1.5}), and high-resolution comparison plots (loss_curves.png, perplexity_comparison.png, accuracy_comparison.png, training_time_comparison.png).</w:t>
+      </w:r>
+    </w:p>
+    <w:p>
+      <w:pPr>
+        <w:pStyle w:val="ListBullet"/>
+        <w:spacing w:after="60"/>
+      </w:pPr>
+      <w:r>
+        <w:rPr>
+          <w:b/>
+          <w:sz w:val="18"/>
+        </w:rPr>
+        <w:t xml:space="preserve">Comprehensive Technical Report (README.md): </w:t>
+      </w:r>
+      <w:r>
+        <w:rPr>
+          <w:sz w:val="18"/>
+        </w:rPr>
+        <w:t>Complete report covering problem formulation, dataset characteristics, architecture details, experimental protocol, full evaluation tables, temperature analysis, and model justification.</w:t>
+      </w:r>
+    </w:p>
+    <w:p>
+      <w:pPr>
+        <w:spacing w:after="160"/>
+      </w:pPr>
+    </w:p>
+    <w:p>
+      <w:pPr>
+        <w:pStyle w:val="Heading1"/>
+      </w:pPr>
+      <w:r>
+        <w:rPr>
+          <w:b/>
+          <w:color w:val="000000"/>
+          <w:sz w:val="23"/>
+        </w:rPr>
+        <w:t>3. Summary of Key Experimental Findings</w:t>
+      </w:r>
+    </w:p>
+    <w:p>
+      <w:pPr>
+        <w:pStyle w:val="ListBullet"/>
+        <w:spacing w:after="60"/>
+      </w:pPr>
+      <w:r>
+        <w:rPr>
+          <w:b/>
+          <w:sz w:val="18"/>
+        </w:rPr>
+        <w:t xml:space="preserve">Best Performing Model: </w:t>
+      </w:r>
+      <w:r>
+        <w:rPr>
+          <w:sz w:val="18"/>
+        </w:rPr>
+        <w:t>LSTM achieved the strongest next-word prediction performance (Best Val Loss: 3.9903, Val Perplexity: 54.07, Held-Out Test Top-1 Accuracy: 23.29%, Test Top-5 Accuracy: 47.23%), with GRU performing closely behind (Val Loss: 4.0353, Test Top-1: 22.53%) with 11% fewer parameters.</w:t>
+      </w:r>
+    </w:p>
+    <w:p>
+      <w:pPr>
+        <w:pStyle w:val="ListBullet"/>
+        <w:spacing w:after="60"/>
+      </w:pPr>
+      <w:r>
+        <w:rPr>
+          <w:b/>
+          <w:sz w:val="18"/>
+        </w:rPr>
+        <w:t xml:space="preserve">Sampling Temperature Optimization: </w:t>
+      </w:r>
+      <w:r>
+        <w:rPr>
+          <w:sz w:val="18"/>
+        </w:rPr>
+        <w:t>Temperature T = 0.5 demonstrated the optimal empirical trade-off between lexical diversity (Distinct-1: 0.60–0.73) and structural coherence, eliminating repetition loops while maintaining fluent narrative dialogue tags.</w:t>
+      </w:r>
+    </w:p>
+    <w:p>
+      <w:pPr>
+        <w:jc w:val="center"/>
+      </w:pPr>
+      <w:r>
+        <w:rPr>
+          <w:i/>
+          <w:sz w:val="17"/>
+        </w:rPr>
+        <w:t>Submitted in fulfillment of Steps 3 and 4 of the Assignment 2 submission procedure for ICT4403.</w:t>
       </w:r>
     </w:p>
     <w:sectPr>
       <w:pgSz w:w="12240" w:h="15840"/>
-      <w:pgMar w:top="1440" w:right="1440" w:bottom="1440" w:left="1440" w:header="720" w:footer="720" w:gutter="0"/>
+      <w:pgMar w:top="1080" w:right="1152" w:bottom="1080" w:left="1152" w:header="720" w:footer="720" w:gutter="0"/>
       <w:cols w:space="720"/>
       <w:docGrid w:linePitch="360"/>
     </w:sectPr>

</xml_diff>

<commit_message>
Format submission document to contain strictly the 6 details requested in Step 3
</commit_message>
<xml_diff>
--- a/SakshamGupta_230911186_FGAI_Assignment2.docx
+++ b/SakshamGupta_230911186_FGAI_Assignment2.docx
@@ -10,9 +10,9 @@
         <w:rPr>
           <w:b/>
           <w:color w:val="000000"/>
-          <w:sz w:val="30"/>
+          <w:sz w:val="36"/>
         </w:rPr>
-        <w:t>FOUNDATIONS OF GENERATIVE AI (ICT4403)</w:t>
+        <w:t>Foundations of Generative AI (ICT4403)</w:t>
       </w:r>
     </w:p>
     <w:p>
@@ -22,7 +22,7 @@
       <w:r>
         <w:rPr>
           <w:b/>
-          <w:sz w:val="24"/>
+          <w:sz w:val="28"/>
         </w:rPr>
         <w:t>Assignment 2: Autoregressive Text Generation System</w:t>
         <w:br/>
@@ -30,28 +30,15 @@
       <w:r>
         <w:rPr>
           <w:i/>
-          <w:sz w:val="20"/>
+          <w:sz w:val="24"/>
         </w:rPr>
-        <w:t>Submission Document &amp; GitHub Repository Verification Sheet</w:t>
+        <w:t>Step 3: Share the GitHub Repository Link</w:t>
       </w:r>
     </w:p>
     <w:p>
       <w:pPr>
-        <w:spacing w:after="160"/>
+        <w:spacing w:after="480"/>
       </w:pPr>
-    </w:p>
-    <w:p>
-      <w:pPr>
-        <w:pStyle w:val="Heading1"/>
-      </w:pPr>
-      <w:r>
-        <w:rPr>
-          <w:b/>
-          <w:color w:val="000000"/>
-          <w:sz w:val="23"/>
-        </w:rPr>
-        <w:t>1. Required Submission Details (Step 3)</w:t>
-      </w:r>
     </w:p>
     <w:tbl>
       <w:tblPr>
@@ -61,19 +48,22 @@
         <w:tblLook w:firstColumn="1" w:firstRow="1" w:lastColumn="0" w:lastRow="0" w:noHBand="0" w:noVBand="1" w:val="04A0"/>
       </w:tblPr>
       <w:tblGrid>
-        <w:gridCol w:w="4968"/>
-        <w:gridCol w:w="4968"/>
+        <w:gridCol w:w="4680"/>
+        <w:gridCol w:w="4680"/>
       </w:tblGrid>
       <w:tr>
         <w:tc>
           <w:tcPr>
-            <w:tcW w:type="dxa" w:w="3600"/>
+            <w:tcW w:type="dxa" w:w="3744"/>
           </w:tcPr>
           <w:p>
+            <w:pPr>
+              <w:spacing w:before="120" w:after="120"/>
+            </w:pPr>
             <w:r>
               <w:rPr>
                 <w:b/>
-                <w:sz w:val="19"/>
+                <w:sz w:val="22"/>
               </w:rPr>
               <w:t>Student Name</w:t>
             </w:r>
@@ -81,12 +71,15 @@
         </w:tc>
         <w:tc>
           <w:tcPr>
-            <w:tcW w:type="dxa" w:w="6336"/>
+            <w:tcW w:type="dxa" w:w="6048"/>
           </w:tcPr>
           <w:p>
+            <w:pPr>
+              <w:spacing w:before="120" w:after="120"/>
+            </w:pPr>
             <w:r>
               <w:rPr>
-                <w:sz w:val="19"/>
+                <w:sz w:val="22"/>
               </w:rPr>
               <w:t>Saksham Gupta</w:t>
             </w:r>
@@ -96,13 +89,16 @@
       <w:tr>
         <w:tc>
           <w:tcPr>
-            <w:tcW w:type="dxa" w:w="3600"/>
+            <w:tcW w:type="dxa" w:w="3744"/>
           </w:tcPr>
           <w:p>
+            <w:pPr>
+              <w:spacing w:before="120" w:after="120"/>
+            </w:pPr>
             <w:r>
               <w:rPr>
                 <w:b/>
-                <w:sz w:val="19"/>
+                <w:sz w:val="22"/>
               </w:rPr>
               <w:t>Registration Number</w:t>
             </w:r>
@@ -110,12 +106,15 @@
         </w:tc>
         <w:tc>
           <w:tcPr>
-            <w:tcW w:type="dxa" w:w="6336"/>
+            <w:tcW w:type="dxa" w:w="6048"/>
           </w:tcPr>
           <w:p>
+            <w:pPr>
+              <w:spacing w:before="120" w:after="120"/>
+            </w:pPr>
             <w:r>
               <w:rPr>
-                <w:sz w:val="19"/>
+                <w:sz w:val="22"/>
               </w:rPr>
               <w:t>230911186</w:t>
             </w:r>
@@ -125,13 +124,16 @@
       <w:tr>
         <w:tc>
           <w:tcPr>
-            <w:tcW w:type="dxa" w:w="3600"/>
+            <w:tcW w:type="dxa" w:w="3744"/>
           </w:tcPr>
           <w:p>
+            <w:pPr>
+              <w:spacing w:before="120" w:after="120"/>
+            </w:pPr>
             <w:r>
               <w:rPr>
                 <w:b/>
-                <w:sz w:val="19"/>
+                <w:sz w:val="22"/>
               </w:rPr>
               <w:t>Assignment Title</w:t>
             </w:r>
@@ -139,12 +141,15 @@
         </w:tc>
         <w:tc>
           <w:tcPr>
-            <w:tcW w:type="dxa" w:w="6336"/>
+            <w:tcW w:type="dxa" w:w="6048"/>
           </w:tcPr>
           <w:p>
+            <w:pPr>
+              <w:spacing w:before="120" w:after="120"/>
+            </w:pPr>
             <w:r>
               <w:rPr>
-                <w:sz w:val="19"/>
+                <w:sz w:val="22"/>
               </w:rPr>
               <w:t>Foundations of Generative AI (ICT4403) — Assignment 2</w:t>
             </w:r>
@@ -154,13 +159,16 @@
       <w:tr>
         <w:tc>
           <w:tcPr>
-            <w:tcW w:type="dxa" w:w="3600"/>
+            <w:tcW w:type="dxa" w:w="3744"/>
           </w:tcPr>
           <w:p>
+            <w:pPr>
+              <w:spacing w:before="120" w:after="120"/>
+            </w:pPr>
             <w:r>
               <w:rPr>
                 <w:b/>
-                <w:sz w:val="19"/>
+                <w:sz w:val="22"/>
               </w:rPr>
               <w:t>Title of the Developed Autoregressive Text-Generation System</w:t>
             </w:r>
@@ -168,12 +176,15 @@
         </w:tc>
         <w:tc>
           <w:tcPr>
-            <w:tcW w:type="dxa" w:w="6336"/>
+            <w:tcW w:type="dxa" w:w="6048"/>
           </w:tcPr>
           <w:p>
+            <w:pPr>
+              <w:spacing w:before="120" w:after="120"/>
+            </w:pPr>
             <w:r>
               <w:rPr>
-                <w:sz w:val="19"/>
+                <w:sz w:val="22"/>
               </w:rPr>
               <w:t>Comparative Word-Level Autoregressive Text Generation on Lewis Carroll's Alice's Adventures in Wonderland using Simple RNN, Bidirectional RNN, LSTM, and GRU</w:t>
             </w:r>
@@ -183,13 +194,16 @@
       <w:tr>
         <w:tc>
           <w:tcPr>
-            <w:tcW w:type="dxa" w:w="3600"/>
+            <w:tcW w:type="dxa" w:w="3744"/>
           </w:tcPr>
           <w:p>
+            <w:pPr>
+              <w:spacing w:before="120" w:after="120"/>
+            </w:pPr>
             <w:r>
               <w:rPr>
                 <w:b/>
-                <w:sz w:val="19"/>
+                <w:sz w:val="22"/>
               </w:rPr>
               <w:t>Name and Link of the Dataset Used</w:t>
             </w:r>
@@ -197,16 +211,18 @@
         </w:tc>
         <w:tc>
           <w:tcPr>
-            <w:tcW w:type="dxa" w:w="6336"/>
+            <w:tcW w:type="dxa" w:w="6048"/>
           </w:tcPr>
           <w:p>
+            <w:pPr>
+              <w:spacing w:before="120" w:after="120"/>
+            </w:pPr>
             <w:r>
               <w:rPr>
-                <w:sz w:val="19"/>
+                <w:sz w:val="22"/>
               </w:rPr>
               <w:t>Alice's Adventures in Wonderland (Lewis Carroll, Project Gutenberg eBook #11)</w:t>
               <w:br/>
-              <w:t xml:space="preserve">Dataset Link: </w:t>
             </w:r>
             <w:hyperlink r:id="rId9">
               <w:r>
@@ -223,13 +239,16 @@
       <w:tr>
         <w:tc>
           <w:tcPr>
-            <w:tcW w:type="dxa" w:w="3600"/>
+            <w:tcW w:type="dxa" w:w="3744"/>
           </w:tcPr>
           <w:p>
+            <w:pPr>
+              <w:spacing w:before="120" w:after="120"/>
+            </w:pPr>
             <w:r>
               <w:rPr>
                 <w:b/>
-                <w:sz w:val="19"/>
+                <w:sz w:val="22"/>
               </w:rPr>
               <w:t>GitHub Repository Link</w:t>
             </w:r>
@@ -237,15 +256,12 @@
         </w:tc>
         <w:tc>
           <w:tcPr>
-            <w:tcW w:type="dxa" w:w="6336"/>
+            <w:tcW w:type="dxa" w:w="6048"/>
           </w:tcPr>
           <w:p>
-            <w:r>
-              <w:rPr>
-                <w:sz w:val="19"/>
-              </w:rPr>
-              <w:t xml:space="preserve">Repository Link: </w:t>
-            </w:r>
+            <w:pPr>
+              <w:spacing w:before="120" w:after="120"/>
+            </w:pPr>
             <w:hyperlink r:id="rId10">
               <w:r>
                 <w:rPr>
@@ -259,198 +275,9 @@
         </w:tc>
       </w:tr>
     </w:tbl>
-    <w:p>
-      <w:pPr>
-        <w:spacing w:after="240"/>
-      </w:pPr>
-    </w:p>
-    <w:p>
-      <w:pPr>
-        <w:pStyle w:val="Heading1"/>
-      </w:pPr>
-      <w:r>
-        <w:rPr>
-          <w:b/>
-          <w:color w:val="000000"/>
-          <w:sz w:val="23"/>
-        </w:rPr>
-        <w:t>2. GitHub Repository Structure &amp; Verified Deliverables (Step 2)</w:t>
-      </w:r>
-    </w:p>
-    <w:p>
-      <w:pPr>
-        <w:spacing w:after="80"/>
-      </w:pPr>
-      <w:r>
-        <w:t>All implementation code, pre-trained model checkpoints, interactive notebooks, plots, and experimental data are hosted in the public GitHub repository above in strict compliance with the assignment guidelines:</w:t>
-      </w:r>
-    </w:p>
-    <w:p>
-      <w:pPr>
-        <w:pStyle w:val="ListBullet"/>
-        <w:spacing w:after="60"/>
-      </w:pPr>
-      <w:r>
-        <w:rPr>
-          <w:b/>
-          <w:sz w:val="18"/>
-        </w:rPr>
-        <w:t xml:space="preserve">Complete Source Implementation (src/): </w:t>
-      </w:r>
-      <w:r>
-        <w:rPr>
-          <w:sz w:val="18"/>
-        </w:rPr>
-        <w:t>Modular PyTorch implementation containing preprocessing.py (chronological 80/10/10 split, train-only vocabulary fitting with min_freq=2), models.py (Simple RNN, BiRNN with [h_n[-2], h_n[-1]] state concatenation, LSTM, and GRU), train.py (training loop with validation checkpointing), evaluate.py (loss, perplexity, Top-1/Top-5 accuracy), and generate.py (temperature sampling, Distinct-1/2, trigram repetition metrics).</w:t>
-      </w:r>
-    </w:p>
-    <w:p>
-      <w:pPr>
-        <w:pStyle w:val="ListBullet"/>
-        <w:spacing w:after="60"/>
-      </w:pPr>
-      <w:r>
-        <w:rPr>
-          <w:b/>
-          <w:sz w:val="18"/>
-        </w:rPr>
-        <w:t xml:space="preserve">Interactive Jupyter Notebook (notebooks/text_generation_assignment2.ipynb): </w:t>
-      </w:r>
-      <w:r>
-        <w:rPr>
-          <w:sz w:val="18"/>
-        </w:rPr>
-        <w:t>Complete, fully executed notebook with all 11 cells containing data preparation, model training progress, evaluation plots, and generated text outputs.</w:t>
-      </w:r>
-    </w:p>
-    <w:p>
-      <w:pPr>
-        <w:pStyle w:val="ListBullet"/>
-        <w:spacing w:after="60"/>
-      </w:pPr>
-      <w:r>
-        <w:rPr>
-          <w:b/>
-          <w:sz w:val="18"/>
-        </w:rPr>
-        <w:t xml:space="preserve">Automated End-to-End Pipeline (run_experiments.py): </w:t>
-      </w:r>
-      <w:r>
-        <w:rPr>
-          <w:sz w:val="18"/>
-        </w:rPr>
-        <w:t>Single-command reproduction script executing the full experimental workflow: preprocessing, training, evaluation, plotting, and generation.</w:t>
-      </w:r>
-    </w:p>
-    <w:p>
-      <w:pPr>
-        <w:pStyle w:val="ListBullet"/>
-        <w:spacing w:after="60"/>
-      </w:pPr>
-      <w:r>
-        <w:rPr>
-          <w:b/>
-          <w:sz w:val="18"/>
-        </w:rPr>
-        <w:t xml:space="preserve">Empirical Results &amp; Visualizations (results/): </w:t>
-      </w:r>
-      <w:r>
-        <w:rPr>
-          <w:sz w:val="18"/>
-        </w:rPr>
-        <w:t>Tabular CSV reports, generated sample logs across temperatures (T ∈ {0.2, 0.5, 1.0, 1.5}), and high-resolution comparison plots (loss_curves.png, perplexity_comparison.png, accuracy_comparison.png, training_time_comparison.png).</w:t>
-      </w:r>
-    </w:p>
-    <w:p>
-      <w:pPr>
-        <w:pStyle w:val="ListBullet"/>
-        <w:spacing w:after="60"/>
-      </w:pPr>
-      <w:r>
-        <w:rPr>
-          <w:b/>
-          <w:sz w:val="18"/>
-        </w:rPr>
-        <w:t xml:space="preserve">Comprehensive Technical Report (README.md): </w:t>
-      </w:r>
-      <w:r>
-        <w:rPr>
-          <w:sz w:val="18"/>
-        </w:rPr>
-        <w:t>Complete report covering problem formulation, dataset characteristics, architecture details, experimental protocol, full evaluation tables, temperature analysis, and model justification.</w:t>
-      </w:r>
-    </w:p>
-    <w:p>
-      <w:pPr>
-        <w:spacing w:after="160"/>
-      </w:pPr>
-    </w:p>
-    <w:p>
-      <w:pPr>
-        <w:pStyle w:val="Heading1"/>
-      </w:pPr>
-      <w:r>
-        <w:rPr>
-          <w:b/>
-          <w:color w:val="000000"/>
-          <w:sz w:val="23"/>
-        </w:rPr>
-        <w:t>3. Summary of Key Experimental Findings</w:t>
-      </w:r>
-    </w:p>
-    <w:p>
-      <w:pPr>
-        <w:pStyle w:val="ListBullet"/>
-        <w:spacing w:after="60"/>
-      </w:pPr>
-      <w:r>
-        <w:rPr>
-          <w:b/>
-          <w:sz w:val="18"/>
-        </w:rPr>
-        <w:t xml:space="preserve">Best Performing Model: </w:t>
-      </w:r>
-      <w:r>
-        <w:rPr>
-          <w:sz w:val="18"/>
-        </w:rPr>
-        <w:t>LSTM achieved the strongest next-word prediction performance (Best Val Loss: 3.9903, Val Perplexity: 54.07, Held-Out Test Top-1 Accuracy: 23.29%, Test Top-5 Accuracy: 47.23%), with GRU performing closely behind (Val Loss: 4.0353, Test Top-1: 22.53%) with 11% fewer parameters.</w:t>
-      </w:r>
-    </w:p>
-    <w:p>
-      <w:pPr>
-        <w:pStyle w:val="ListBullet"/>
-        <w:spacing w:after="60"/>
-      </w:pPr>
-      <w:r>
-        <w:rPr>
-          <w:b/>
-          <w:sz w:val="18"/>
-        </w:rPr>
-        <w:t xml:space="preserve">Sampling Temperature Optimization: </w:t>
-      </w:r>
-      <w:r>
-        <w:rPr>
-          <w:sz w:val="18"/>
-        </w:rPr>
-        <w:t>Temperature T = 0.5 demonstrated the optimal empirical trade-off between lexical diversity (Distinct-1: 0.60–0.73) and structural coherence, eliminating repetition loops while maintaining fluent narrative dialogue tags.</w:t>
-      </w:r>
-    </w:p>
-    <w:p>
-      <w:pPr>
-        <w:jc w:val="center"/>
-      </w:pPr>
-      <w:r>
-        <w:rPr>
-          <w:i/>
-          <w:sz w:val="17"/>
-        </w:rPr>
-        <w:t>Submitted in fulfillment of Steps 3 and 4 of the Assignment 2 submission procedure for ICT4403.</w:t>
-      </w:r>
-    </w:p>
     <w:sectPr>
       <w:pgSz w:w="12240" w:h="15840"/>
-      <w:pgMar w:top="1080" w:right="1152" w:bottom="1080" w:left="1152" w:header="720" w:footer="720" w:gutter="0"/>
+      <w:pgMar w:top="1728" w:right="1440" w:bottom="1728" w:left="1440" w:header="720" w:footer="720" w:gutter="0"/>
       <w:cols w:space="720"/>
       <w:docGrid w:linePitch="360"/>
     </w:sectPr>

</xml_diff>

<commit_message>
Style Step 3 submission document matching reference structure with 7 rows and premium academic typography
</commit_message>
<xml_diff>
--- a/SakshamGupta_230911186_FGAI_Assignment2.docx
+++ b/SakshamGupta_230911186_FGAI_Assignment2.docx
@@ -21,23 +21,14 @@
       </w:pPr>
       <w:r>
         <w:rPr>
-          <w:b/>
-          <w:sz w:val="28"/>
+          <w:sz w:val="26"/>
         </w:rPr>
-        <w:t>Assignment 2: Autoregressive Text Generation System</w:t>
-        <w:br/>
-      </w:r>
-      <w:r>
-        <w:rPr>
-          <w:i/>
-          <w:sz w:val="24"/>
-        </w:rPr>
-        <w:t>Step 3: Share the GitHub Repository Link</w:t>
+        <w:t>Assignment 2 – Submission Details</w:t>
       </w:r>
     </w:p>
     <w:p>
       <w:pPr>
-        <w:spacing w:after="480"/>
+        <w:spacing w:after="400"/>
       </w:pPr>
     </w:p>
     <w:tbl>
@@ -58,14 +49,14 @@
           </w:tcPr>
           <w:p>
             <w:pPr>
-              <w:spacing w:before="120" w:after="120"/>
+              <w:spacing w:before="100" w:after="100"/>
             </w:pPr>
             <w:r>
               <w:rPr>
                 <w:b/>
-                <w:sz w:val="22"/>
+                <w:sz w:val="21"/>
               </w:rPr>
-              <w:t>Student Name</w:t>
+              <w:t>Student name</w:t>
             </w:r>
           </w:p>
         </w:tc>
@@ -75,11 +66,11 @@
           </w:tcPr>
           <w:p>
             <w:pPr>
-              <w:spacing w:before="120" w:after="120"/>
+              <w:spacing w:before="100" w:after="100"/>
             </w:pPr>
             <w:r>
               <w:rPr>
-                <w:sz w:val="22"/>
+                <w:sz w:val="21"/>
               </w:rPr>
               <w:t>Saksham Gupta</w:t>
             </w:r>
@@ -93,14 +84,14 @@
           </w:tcPr>
           <w:p>
             <w:pPr>
-              <w:spacing w:before="120" w:after="120"/>
+              <w:spacing w:before="100" w:after="100"/>
             </w:pPr>
             <w:r>
               <w:rPr>
                 <w:b/>
-                <w:sz w:val="22"/>
+                <w:sz w:val="21"/>
               </w:rPr>
-              <w:t>Registration Number</w:t>
+              <w:t>Registration number</w:t>
             </w:r>
           </w:p>
         </w:tc>
@@ -110,11 +101,11 @@
           </w:tcPr>
           <w:p>
             <w:pPr>
-              <w:spacing w:before="120" w:after="120"/>
+              <w:spacing w:before="100" w:after="100"/>
             </w:pPr>
             <w:r>
               <w:rPr>
-                <w:sz w:val="22"/>
+                <w:sz w:val="21"/>
               </w:rPr>
               <w:t>230911186</w:t>
             </w:r>
@@ -128,14 +119,14 @@
           </w:tcPr>
           <w:p>
             <w:pPr>
-              <w:spacing w:before="120" w:after="120"/>
+              <w:spacing w:before="100" w:after="100"/>
             </w:pPr>
             <w:r>
               <w:rPr>
                 <w:b/>
-                <w:sz w:val="22"/>
+                <w:sz w:val="21"/>
               </w:rPr>
-              <w:t>Assignment Title</w:t>
+              <w:t>Assignment title</w:t>
             </w:r>
           </w:p>
         </w:tc>
@@ -145,13 +136,13 @@
           </w:tcPr>
           <w:p>
             <w:pPr>
-              <w:spacing w:before="120" w:after="120"/>
+              <w:spacing w:before="100" w:after="100"/>
             </w:pPr>
             <w:r>
               <w:rPr>
-                <w:sz w:val="22"/>
+                <w:sz w:val="21"/>
               </w:rPr>
-              <w:t>Foundations of Generative AI (ICT4403) — Assignment 2</w:t>
+              <w:t>Foundations of Generative AI (ICT4403) – Assignment 2</w:t>
             </w:r>
           </w:p>
         </w:tc>
@@ -163,14 +154,14 @@
           </w:tcPr>
           <w:p>
             <w:pPr>
-              <w:spacing w:before="120" w:after="120"/>
+              <w:spacing w:before="100" w:after="100"/>
             </w:pPr>
             <w:r>
               <w:rPr>
                 <w:b/>
-                <w:sz w:val="22"/>
+                <w:sz w:val="21"/>
               </w:rPr>
-              <w:t>Title of the Developed Autoregressive Text-Generation System</w:t>
+              <w:t>Title of the developed autoregressive text-generation system</w:t>
             </w:r>
           </w:p>
         </w:tc>
@@ -180,11 +171,11 @@
           </w:tcPr>
           <w:p>
             <w:pPr>
-              <w:spacing w:before="120" w:after="120"/>
+              <w:spacing w:before="100" w:after="100"/>
             </w:pPr>
             <w:r>
               <w:rPr>
-                <w:sz w:val="22"/>
+                <w:sz w:val="21"/>
               </w:rPr>
               <w:t>Comparative Word-Level Autoregressive Text Generation on Lewis Carroll's Alice's Adventures in Wonderland using Simple RNN, Bidirectional RNN, LSTM, and GRU</w:t>
             </w:r>
@@ -198,14 +189,14 @@
           </w:tcPr>
           <w:p>
             <w:pPr>
-              <w:spacing w:before="120" w:after="120"/>
+              <w:spacing w:before="100" w:after="100"/>
             </w:pPr>
             <w:r>
               <w:rPr>
                 <w:b/>
-                <w:sz w:val="22"/>
+                <w:sz w:val="21"/>
               </w:rPr>
-              <w:t>Name and Link of the Dataset Used</w:t>
+              <w:t>Dataset name</w:t>
             </w:r>
           </w:p>
         </w:tc>
@@ -215,15 +206,43 @@
           </w:tcPr>
           <w:p>
             <w:pPr>
-              <w:spacing w:before="120" w:after="120"/>
+              <w:spacing w:before="100" w:after="100"/>
             </w:pPr>
             <w:r>
               <w:rPr>
-                <w:sz w:val="22"/>
+                <w:sz w:val="21"/>
               </w:rPr>
-              <w:t>Alice's Adventures in Wonderland (Lewis Carroll, Project Gutenberg eBook #11)</w:t>
-              <w:br/>
+              <w:t>Alice's Adventures in Wonderland by Lewis Carroll (Project Gutenberg eBook #11)</w:t>
             </w:r>
+          </w:p>
+        </w:tc>
+      </w:tr>
+      <w:tr>
+        <w:tc>
+          <w:tcPr>
+            <w:tcW w:type="dxa" w:w="3744"/>
+          </w:tcPr>
+          <w:p>
+            <w:pPr>
+              <w:spacing w:before="100" w:after="100"/>
+            </w:pPr>
+            <w:r>
+              <w:rPr>
+                <w:b/>
+                <w:sz w:val="21"/>
+              </w:rPr>
+              <w:t>Dataset link</w:t>
+            </w:r>
+          </w:p>
+        </w:tc>
+        <w:tc>
+          <w:tcPr>
+            <w:tcW w:type="dxa" w:w="6048"/>
+          </w:tcPr>
+          <w:p>
+            <w:pPr>
+              <w:spacing w:before="100" w:after="100"/>
+            </w:pPr>
             <w:hyperlink r:id="rId9">
               <w:r>
                 <w:rPr>
@@ -243,14 +262,14 @@
           </w:tcPr>
           <w:p>
             <w:pPr>
-              <w:spacing w:before="120" w:after="120"/>
+              <w:spacing w:before="100" w:after="100"/>
             </w:pPr>
             <w:r>
               <w:rPr>
                 <w:b/>
-                <w:sz w:val="22"/>
+                <w:sz w:val="21"/>
               </w:rPr>
-              <w:t>GitHub Repository Link</w:t>
+              <w:t>GitHub repository link</w:t>
             </w:r>
           </w:p>
         </w:tc>
@@ -260,7 +279,7 @@
           </w:tcPr>
           <w:p>
             <w:pPr>
-              <w:spacing w:before="120" w:after="120"/>
+              <w:spacing w:before="100" w:after="100"/>
             </w:pPr>
             <w:hyperlink r:id="rId10">
               <w:r>

</xml_diff>